<commit_message>
Adding a new Pattern "EARS pattern for DTS Requirements Engineering" within the RECP
</commit_message>
<xml_diff>
--- a/recp/PatternsRECPLevelData/PatternsDiagramImages/MockRECP/Nouveau Document Microsoft Word.docx
+++ b/recp/PatternsRECPLevelData/PatternsDiagramImages/MockRECP/Nouveau Document Microsoft Word.docx
@@ -205,19 +205,7 @@
         <w:rPr>
           <w:lang w:val="en-US"/>
         </w:rPr>
-        <w:t>(system</w:t>
-      </w:r>
-      <w:r>
-        <w:rPr>
-          <w:lang w:val="en-US"/>
-        </w:rPr>
-        <w:t>’s</w:t>
-      </w:r>
-      <w:r>
-        <w:rPr>
-          <w:lang w:val="en-US"/>
-        </w:rPr>
-        <w:t xml:space="preserve">) </w:t>
+        <w:t xml:space="preserve">(system’s) </w:t>
       </w:r>
       <w:r>
         <w:rPr>
@@ -338,7 +326,115 @@
         <w:rPr>
           <w:lang w:val="en-US"/>
         </w:rPr>
-        <w:t>on a DTS (Digital Twin System) of a Workshop A</w:t>
+        <w:t xml:space="preserve">on a DTS (Digital Twin System) of a Workshop A </w:t>
+      </w:r>
+      <w:r>
+        <w:rPr>
+          <w:lang w:val="en-US"/>
+        </w:rPr>
+        <w:t>“B</w:t>
+      </w:r>
+      <w:r>
+        <w:rPr>
+          <w:lang w:val="en-US"/>
+        </w:rPr>
+        <w:t>T001</w:t>
+      </w:r>
+      <w:r>
+        <w:rPr>
+          <w:lang w:val="en-US"/>
+        </w:rPr>
+        <w:t xml:space="preserve">- </w:t>
+      </w:r>
+      <w:r>
+        <w:rPr>
+          <w:lang w:val="en-US"/>
+        </w:rPr>
+        <w:t xml:space="preserve">The user wants all </w:t>
+      </w:r>
+      <w:r>
+        <w:rPr>
+          <w:lang w:val="en-US"/>
+        </w:rPr>
+        <w:t>H</w:t>
+      </w:r>
+      <w:r>
+        <w:rPr>
+          <w:lang w:val="en-US"/>
+        </w:rPr>
+        <w:t>uman-</w:t>
+      </w:r>
+      <w:r>
+        <w:rPr>
+          <w:lang w:val="en-US"/>
+        </w:rPr>
+        <w:t>M</w:t>
+      </w:r>
+      <w:r>
+        <w:rPr>
+          <w:lang w:val="en-US"/>
+        </w:rPr>
+        <w:t xml:space="preserve">achine </w:t>
+      </w:r>
+      <w:r>
+        <w:rPr>
+          <w:lang w:val="en-US"/>
+        </w:rPr>
+        <w:t>I</w:t>
+      </w:r>
+      <w:r>
+        <w:rPr>
+          <w:lang w:val="en-US"/>
+        </w:rPr>
+        <w:t>nterfaces (HMIs) o</w:t>
+      </w:r>
+      <w:r>
+        <w:rPr>
+          <w:lang w:val="en-US"/>
+        </w:rPr>
+        <w:t>f</w:t>
+      </w:r>
+      <w:r>
+        <w:rPr>
+          <w:lang w:val="en-US"/>
+        </w:rPr>
+        <w:t xml:space="preserve"> the </w:t>
+      </w:r>
+      <w:r>
+        <w:rPr>
+          <w:lang w:val="en-US"/>
+        </w:rPr>
+        <w:t>W</w:t>
+      </w:r>
+      <w:r>
+        <w:rPr>
+          <w:lang w:val="en-US"/>
+        </w:rPr>
+        <w:t>orkshop A</w:t>
+      </w:r>
+      <w:r>
+        <w:rPr>
+          <w:lang w:val="en-US"/>
+        </w:rPr>
+        <w:t xml:space="preserve">’s DTS </w:t>
+      </w:r>
+      <w:r>
+        <w:rPr>
+          <w:lang w:val="en-US"/>
+        </w:rPr>
+        <w:t>to be highly intuitive</w:t>
+      </w:r>
+      <w:r>
+        <w:rPr>
+          <w:lang w:val="en-US"/>
+        </w:rPr>
+        <w:t>”</w:t>
+      </w:r>
+      <w:r>
+        <w:rPr>
+          <w:lang w:val="en-US"/>
+        </w:rPr>
+        <w:t>.</w:t>
       </w:r>
       <w:r>
         <w:rPr>
@@ -350,7 +446,73 @@
         <w:rPr>
           <w:lang w:val="en-US"/>
         </w:rPr>
-        <w:t>“B</w:t>
+        <w:t>T</w:t>
+      </w:r>
+      <w:r>
+        <w:rPr>
+          <w:lang w:val="en-US"/>
+        </w:rPr>
+        <w:t xml:space="preserve">hanks to the application of a RUPP’s boilerplate, </w:t>
+      </w:r>
+      <w:r>
+        <w:rPr>
+          <w:lang w:val="en-US"/>
+        </w:rPr>
+        <w:t>three</w:t>
+      </w:r>
+      <w:r>
+        <w:rPr>
+          <w:lang w:val="en-US"/>
+        </w:rPr>
+        <w:t xml:space="preserve"> corresponding </w:t>
+      </w:r>
+      <w:r>
+        <w:rPr>
+          <w:lang w:val="en-US"/>
+        </w:rPr>
+        <w:t xml:space="preserve">system’s </w:t>
+      </w:r>
+      <w:r>
+        <w:rPr>
+          <w:lang w:val="en-US"/>
+        </w:rPr>
+        <w:t>requirement</w:t>
+      </w:r>
+      <w:r>
+        <w:rPr>
+          <w:lang w:val="en-US"/>
+        </w:rPr>
+        <w:t>s</w:t>
+      </w:r>
+      <w:r>
+        <w:rPr>
+          <w:lang w:val="en-US"/>
+        </w:rPr>
+        <w:t xml:space="preserve"> </w:t>
+      </w:r>
+      <w:r>
+        <w:rPr>
+          <w:lang w:val="en-US"/>
+        </w:rPr>
+        <w:t xml:space="preserve">in terms of Interface </w:t>
+      </w:r>
+      <w:r>
+        <w:rPr>
+          <w:lang w:val="en-US"/>
+        </w:rPr>
+        <w:t xml:space="preserve">could be </w:t>
+      </w:r>
+      <w:r>
+        <w:rPr>
+          <w:lang w:val="en-US"/>
+        </w:rPr>
+        <w:t xml:space="preserve">written as follow </w:t>
+      </w:r>
+      <w:r>
+        <w:rPr>
+          <w:lang w:val="en-US"/>
+        </w:rPr>
+        <w:t>“E</w:t>
       </w:r>
       <w:r>
         <w:rPr>
@@ -362,85 +524,411 @@
         <w:rPr>
           <w:lang w:val="en-US"/>
         </w:rPr>
+        <w:t xml:space="preserve"> – </w:t>
+      </w:r>
+      <w:r>
+        <w:rPr>
+          <w:lang w:val="en-US"/>
+        </w:rPr>
+        <w:t>The Workshop A’s DTS should provide the user with the ability to use in a highly intuitive way the HMI dedicated to the simulation</w:t>
+      </w:r>
+      <w:r>
+        <w:rPr>
+          <w:lang w:val="en-US"/>
+        </w:rPr>
+        <w:t>.</w:t>
+      </w:r>
+      <w:r>
+        <w:rPr>
+          <w:lang w:val="en-US"/>
+        </w:rPr>
+        <w:t>”</w:t>
+      </w:r>
+      <w:r>
+        <w:rPr>
+          <w:lang w:val="en-US"/>
+        </w:rPr>
+        <w:t xml:space="preserve">, “ET002 – </w:t>
+      </w:r>
+      <w:r>
+        <w:rPr>
+          <w:lang w:val="en-US"/>
+        </w:rPr>
+        <w:t>The Workshop A’s DTS shall provide the user with the ability to use in a very simple and intuitive way the HMI dedicated to the visualization of the data contained in the database of products orders</w:t>
+      </w:r>
+      <w:r>
+        <w:rPr>
+          <w:lang w:val="en-US"/>
+        </w:rPr>
+        <w:t>.” and “</w:t>
+      </w:r>
+      <w:r>
+        <w:rPr>
+          <w:lang w:val="en-US"/>
+        </w:rPr>
+        <w:t>The Workshop A’s DTS shall provide the user with the ability to use in a very simple and intuitive way the HMI dedicated to the visualization of the data contained in the database of energy loading</w:t>
+      </w:r>
+      <w:r>
+        <w:rPr>
+          <w:lang w:val="en-US"/>
+        </w:rPr>
+        <w:t>.”.</w:t>
+      </w:r>
+    </w:p>
+    <w:p>
+      <w:pPr>
+        <w:pBdr>
+          <w:bottom w:val="double" w:sz="6" w:space="1" w:color="auto"/>
+        </w:pBdr>
+        <w:rPr>
+          <w:lang w:val="en-US"/>
+        </w:rPr>
+      </w:pPr>
+    </w:p>
+    <w:p>
+      <w:pPr>
+        <w:rPr>
+          <w:b/>
+          <w:bCs/>
+          <w:lang w:val="en-US"/>
+        </w:rPr>
+      </w:pPr>
+      <w:r>
+        <w:rPr>
+          <w:b/>
+          <w:bCs/>
+          <w:lang w:val="en-US"/>
+        </w:rPr>
+        <w:t>EARS</w:t>
+      </w:r>
+      <w:r>
+        <w:rPr>
+          <w:b/>
+          <w:bCs/>
+          <w:lang w:val="en-US"/>
+        </w:rPr>
+        <w:t>’ Requirement patterns for D</w:t>
+      </w:r>
+      <w:r>
+        <w:rPr>
+          <w:b/>
+          <w:bCs/>
+          <w:lang w:val="en-US"/>
+        </w:rPr>
+        <w:t>TS</w:t>
+      </w:r>
+    </w:p>
+    <w:p>
+      <w:pPr>
+        <w:rPr>
+          <w:lang w:val="en-US"/>
+        </w:rPr>
+      </w:pPr>
+      <w:r>
+        <w:rPr>
+          <w:b/>
+          <w:bCs/>
+          <w:lang w:val="en-US"/>
+        </w:rPr>
+        <w:t>Problem </w:t>
+      </w:r>
+      <w:r>
+        <w:rPr>
+          <w:b/>
+          <w:bCs/>
+          <w:lang w:val="en-US"/>
+        </w:rPr>
+        <w:t>Statement</w:t>
+      </w:r>
+      <w:r>
+        <w:rPr>
+          <w:b/>
+          <w:bCs/>
+          <w:lang w:val="en-US"/>
+        </w:rPr>
+        <w:t xml:space="preserve">: </w:t>
+      </w:r>
+      <w:r>
+        <w:rPr>
+          <w:lang w:val="en-US"/>
+        </w:rPr>
+        <w:t>Writing a DTS’ requirement sentence</w:t>
+      </w:r>
+    </w:p>
+    <w:p>
+      <w:pPr>
+        <w:rPr>
+          <w:lang w:val="en-US"/>
+        </w:rPr>
+      </w:pPr>
+      <w:r>
+        <w:rPr>
+          <w:b/>
+          <w:bCs/>
+          <w:lang w:val="en-US"/>
+        </w:rPr>
+        <w:t>Solution</w:t>
+      </w:r>
+      <w:r>
+        <w:rPr>
+          <w:b/>
+          <w:bCs/>
+          <w:lang w:val="en-US"/>
+        </w:rPr>
+        <w:t xml:space="preserve"> Statement</w:t>
+      </w:r>
+      <w:r>
+        <w:rPr>
+          <w:b/>
+          <w:bCs/>
+          <w:lang w:val="en-US"/>
+        </w:rPr>
+        <w:t>:</w:t>
+      </w:r>
+      <w:r>
+        <w:rPr>
+          <w:lang w:val="en-US"/>
+        </w:rPr>
+        <w:t xml:space="preserve"> Applying a </w:t>
+      </w:r>
+      <w:r>
+        <w:rPr>
+          <w:lang w:val="en-US"/>
+        </w:rPr>
+        <w:t>EARS’</w:t>
+      </w:r>
+      <w:r>
+        <w:rPr>
+          <w:lang w:val="en-US"/>
+        </w:rPr>
+        <w:t xml:space="preserve"> boilerplate adapted to the case of DTS’ Engineering</w:t>
+      </w:r>
+    </w:p>
+    <w:p>
+      <w:pPr>
+        <w:rPr>
+          <w:lang w:val="en-US"/>
+        </w:rPr>
+      </w:pPr>
+      <w:r>
+        <w:rPr>
+          <w:b/>
+          <w:bCs/>
+          <w:lang w:val="en-US"/>
+        </w:rPr>
+        <w:t>Example Of Application Statements 1:</w:t>
+      </w:r>
+      <w:r>
+        <w:rPr>
+          <w:lang w:val="en-US"/>
+        </w:rPr>
+        <w:t xml:space="preserve"> </w:t>
+      </w:r>
+      <w:r>
+        <w:rPr>
+          <w:lang w:val="en-US"/>
+        </w:rPr>
+        <w:t>We have</w:t>
+      </w:r>
+      <w:r>
+        <w:rPr>
+          <w:lang w:val="en-US"/>
+        </w:rPr>
+        <w:t xml:space="preserve"> a</w:t>
+      </w:r>
+      <w:r>
+        <w:rPr>
+          <w:lang w:val="en-US"/>
+        </w:rPr>
+        <w:t xml:space="preserve">n expressed </w:t>
+      </w:r>
+      <w:r>
+        <w:rPr>
+          <w:lang w:val="en-US"/>
+        </w:rPr>
+        <w:t>non-</w:t>
+      </w:r>
+      <w:r>
+        <w:rPr>
+          <w:lang w:val="en-US"/>
+        </w:rPr>
+        <w:t xml:space="preserve">functional stakeholder’s requirement (need) </w:t>
+      </w:r>
+      <w:r>
+        <w:rPr>
+          <w:lang w:val="en-US"/>
+        </w:rPr>
+        <w:t xml:space="preserve">in terms of </w:t>
+      </w:r>
+      <w:proofErr w:type="spellStart"/>
+      <w:r>
+        <w:rPr>
+          <w:lang w:val="en-US"/>
+        </w:rPr>
+        <w:t>Evolutivity</w:t>
+      </w:r>
+      <w:proofErr w:type="spellEnd"/>
+      <w:r>
+        <w:rPr>
+          <w:lang w:val="en-US"/>
+        </w:rPr>
+        <w:t xml:space="preserve"> </w:t>
+      </w:r>
+      <w:r>
+        <w:rPr>
+          <w:lang w:val="en-US"/>
+        </w:rPr>
+        <w:t>on a DTS (Digital Twin System) of a Workshop A “</w:t>
+      </w:r>
+      <w:r>
+        <w:rPr>
+          <w:lang w:val="en-US"/>
+        </w:rPr>
+        <w:t>N</w:t>
+      </w:r>
+      <w:r>
+        <w:rPr>
+          <w:lang w:val="en-US"/>
+        </w:rPr>
+        <w:t>N</w:t>
+      </w:r>
+      <w:r>
+        <w:rPr>
+          <w:lang w:val="en-US"/>
+        </w:rPr>
+        <w:t>F</w:t>
+      </w:r>
+      <w:r>
+        <w:rPr>
+          <w:lang w:val="en-US"/>
+        </w:rPr>
+        <w:t>00</w:t>
+      </w:r>
+      <w:r>
+        <w:rPr>
+          <w:lang w:val="en-US"/>
+        </w:rPr>
+        <w:t>4</w:t>
+      </w:r>
+      <w:r>
+        <w:rPr>
+          <w:lang w:val="en-US"/>
+        </w:rPr>
         <w:t xml:space="preserve">- </w:t>
       </w:r>
       <w:r>
         <w:rPr>
           <w:lang w:val="en-US"/>
         </w:rPr>
-        <w:t xml:space="preserve">The user wants all </w:t>
-      </w:r>
-      <w:r>
-        <w:rPr>
-          <w:lang w:val="en-US"/>
-        </w:rPr>
-        <w:t>H</w:t>
-      </w:r>
-      <w:r>
-        <w:rPr>
-          <w:lang w:val="en-US"/>
-        </w:rPr>
-        <w:t>uman-</w:t>
-      </w:r>
-      <w:r>
-        <w:rPr>
-          <w:lang w:val="en-US"/>
-        </w:rPr>
-        <w:t>M</w:t>
-      </w:r>
-      <w:r>
-        <w:rPr>
-          <w:lang w:val="en-US"/>
-        </w:rPr>
-        <w:t xml:space="preserve">achine </w:t>
-      </w:r>
-      <w:r>
-        <w:rPr>
-          <w:lang w:val="en-US"/>
-        </w:rPr>
-        <w:t>I</w:t>
-      </w:r>
-      <w:r>
-        <w:rPr>
-          <w:lang w:val="en-US"/>
-        </w:rPr>
-        <w:t>nterfaces (HMIs) o</w:t>
-      </w:r>
-      <w:r>
-        <w:rPr>
-          <w:lang w:val="en-US"/>
-        </w:rPr>
-        <w:t>f</w:t>
-      </w:r>
-      <w:r>
-        <w:rPr>
-          <w:lang w:val="en-US"/>
-        </w:rPr>
-        <w:t xml:space="preserve"> the </w:t>
-      </w:r>
-      <w:r>
-        <w:rPr>
-          <w:lang w:val="en-US"/>
-        </w:rPr>
-        <w:t>W</w:t>
-      </w:r>
-      <w:r>
-        <w:rPr>
-          <w:lang w:val="en-US"/>
-        </w:rPr>
-        <w:t>orkshop A</w:t>
-      </w:r>
-      <w:r>
-        <w:rPr>
-          <w:lang w:val="en-US"/>
-        </w:rPr>
-        <w:t xml:space="preserve">’s DTS </w:t>
-      </w:r>
-      <w:r>
-        <w:rPr>
-          <w:lang w:val="en-US"/>
-        </w:rPr>
-        <w:t>to be highly intuitive</w:t>
+        <w:t xml:space="preserve">All the stakeholders want the </w:t>
+      </w:r>
+      <w:r>
+        <w:rPr>
+          <w:lang w:val="en-US"/>
+        </w:rPr>
+        <w:t>Workshop A</w:t>
+      </w:r>
+      <w:r>
+        <w:rPr>
+          <w:lang w:val="en-US"/>
+        </w:rPr>
+        <w:t>’s DTS to be easy to evolve</w:t>
+      </w:r>
+      <w:r>
+        <w:rPr>
+          <w:lang w:val="en-US"/>
+        </w:rPr>
+        <w:t>”. Thanks to the application of a</w:t>
+      </w:r>
+      <w:r>
+        <w:rPr>
+          <w:lang w:val="en-US"/>
+        </w:rPr>
+        <w:t>n</w:t>
+      </w:r>
+      <w:r>
+        <w:rPr>
+          <w:lang w:val="en-US"/>
+        </w:rPr>
+        <w:t xml:space="preserve"> </w:t>
+      </w:r>
+      <w:r>
+        <w:rPr>
+          <w:lang w:val="en-US"/>
+        </w:rPr>
+        <w:t>EARS’</w:t>
+      </w:r>
+      <w:r>
+        <w:rPr>
+          <w:lang w:val="en-US"/>
+        </w:rPr>
+        <w:t xml:space="preserve"> boilerplate, a corresponding </w:t>
+      </w:r>
+      <w:r>
+        <w:rPr>
+          <w:lang w:val="en-US"/>
+        </w:rPr>
+        <w:t>non-</w:t>
+      </w:r>
+      <w:r>
+        <w:rPr>
+          <w:lang w:val="en-US"/>
+        </w:rPr>
+        <w:t>functional (system’s) requirement could be written as follow: “</w:t>
+      </w:r>
+      <w:r>
+        <w:rPr>
+          <w:lang w:val="en-US"/>
+        </w:rPr>
+        <w:t>R</w:t>
+      </w:r>
+      <w:r>
+        <w:rPr>
+          <w:lang w:val="en-US"/>
+        </w:rPr>
+        <w:t>NF</w:t>
+      </w:r>
+      <w:r>
+        <w:rPr>
+          <w:lang w:val="en-US"/>
+        </w:rPr>
+        <w:t>00</w:t>
+      </w:r>
+      <w:r>
+        <w:rPr>
+          <w:lang w:val="en-US"/>
+        </w:rPr>
+        <w:t>4</w:t>
+      </w:r>
+      <w:r>
+        <w:rPr>
+          <w:lang w:val="en-US"/>
+        </w:rPr>
+        <w:t xml:space="preserve"> – </w:t>
+      </w:r>
+      <w:r>
+        <w:rPr>
+          <w:lang w:val="en-US"/>
+        </w:rPr>
+        <w:t xml:space="preserve">The </w:t>
+      </w:r>
+      <w:r>
+        <w:rPr>
+          <w:lang w:val="en-US"/>
+        </w:rPr>
+        <w:t>Workshop A’s DTS</w:t>
+      </w:r>
+      <w:r>
+        <w:rPr>
+          <w:lang w:val="en-US"/>
+        </w:rPr>
+        <w:t xml:space="preserve"> shall be easy to evolve</w:t>
+      </w:r>
+      <w:r>
+        <w:rPr>
+          <w:lang w:val="en-US"/>
+        </w:rPr>
+        <w:t>.</w:t>
       </w:r>
       <w:r>
         <w:rPr>
@@ -458,49 +946,237 @@
         <w:rPr>
           <w:lang w:val="en-US"/>
         </w:rPr>
+        <w:t xml:space="preserve">    </w:t>
+      </w:r>
+    </w:p>
+    <w:p>
+      <w:pPr>
+        <w:rPr>
+          <w:lang w:val="en-US"/>
+        </w:rPr>
+      </w:pPr>
+      <w:r>
+        <w:rPr>
+          <w:b/>
+          <w:bCs/>
+          <w:lang w:val="en-US"/>
+        </w:rPr>
+        <w:t xml:space="preserve">Example Of Application Statements </w:t>
+      </w:r>
+      <w:r>
+        <w:rPr>
+          <w:b/>
+          <w:bCs/>
+          <w:lang w:val="en-US"/>
+        </w:rPr>
+        <w:t>2</w:t>
+      </w:r>
+      <w:r>
+        <w:rPr>
+          <w:b/>
+          <w:bCs/>
+          <w:lang w:val="en-US"/>
+        </w:rPr>
+        <w:t>:</w:t>
+      </w:r>
+      <w:r>
+        <w:rPr>
+          <w:lang w:val="en-US"/>
+        </w:rPr>
+        <w:t xml:space="preserve">  </w:t>
+      </w:r>
+      <w:r>
+        <w:rPr>
+          <w:lang w:val="en-US"/>
+        </w:rPr>
+        <w:t>We have</w:t>
+      </w:r>
+      <w:r>
+        <w:rPr>
+          <w:lang w:val="en-US"/>
+        </w:rPr>
+        <w:t xml:space="preserve"> a</w:t>
+      </w:r>
+      <w:r>
+        <w:rPr>
+          <w:lang w:val="en-US"/>
+        </w:rPr>
+        <w:t>n expressed</w:t>
+      </w:r>
+      <w:r>
+        <w:rPr>
+          <w:lang w:val="en-US"/>
+        </w:rPr>
+        <w:t xml:space="preserve"> operational stakeholder’s </w:t>
+      </w:r>
+      <w:r>
+        <w:rPr>
+          <w:lang w:val="en-US"/>
+        </w:rPr>
+        <w:t xml:space="preserve">requirement (need) in terms of </w:t>
+      </w:r>
+      <w:r>
+        <w:rPr>
+          <w:lang w:val="en-US"/>
+        </w:rPr>
+        <w:t>Installation/Deployment/Delivery/Configuration</w:t>
+      </w:r>
+      <w:r>
+        <w:rPr>
+          <w:lang w:val="en-US"/>
+        </w:rPr>
+        <w:t xml:space="preserve"> on a DTS (Digital Twin System) of a </w:t>
+      </w:r>
+      <w:r>
+        <w:rPr>
+          <w:lang w:val="en-US"/>
+        </w:rPr>
+        <w:lastRenderedPageBreak/>
+        <w:t>Workshop A “</w:t>
+      </w:r>
+      <w:r>
+        <w:rPr>
+          <w:lang w:val="en-US"/>
+        </w:rPr>
+        <w:t>NO</w:t>
+      </w:r>
+      <w:r>
+        <w:rPr>
+          <w:lang w:val="en-US"/>
+        </w:rPr>
+        <w:t xml:space="preserve">001- </w:t>
+      </w:r>
+      <w:r>
+        <w:rPr>
+          <w:lang w:val="en-US"/>
+        </w:rPr>
+        <w:t xml:space="preserve">The Company wants any version of any Modeling &amp; Simulation’s sub-project composing the </w:t>
+      </w:r>
+      <w:r>
+        <w:rPr>
+          <w:lang w:val="en-US"/>
+        </w:rPr>
+        <w:t>Workshop A’s DTS</w:t>
+      </w:r>
+      <w:r>
+        <w:rPr>
+          <w:lang w:val="en-US"/>
+        </w:rPr>
+        <w:t xml:space="preserve"> to be stored and accessible for any update-related modifications within a repository</w:t>
+      </w:r>
+      <w:r>
+        <w:rPr>
+          <w:lang w:val="en-US"/>
+        </w:rPr>
+        <w:t>”. Thanks to the application of a</w:t>
+      </w:r>
+      <w:r>
+        <w:rPr>
+          <w:lang w:val="en-US"/>
+        </w:rPr>
+        <w:t>n EARS’</w:t>
+      </w:r>
+      <w:r>
+        <w:rPr>
+          <w:lang w:val="en-US"/>
+        </w:rPr>
+        <w:t xml:space="preserve"> boilerplate, </w:t>
+      </w:r>
+      <w:r>
+        <w:rPr>
+          <w:lang w:val="en-US"/>
+        </w:rPr>
+        <w:t>a</w:t>
+      </w:r>
+      <w:r>
+        <w:rPr>
+          <w:lang w:val="en-US"/>
+        </w:rPr>
+        <w:t xml:space="preserve"> corresponding </w:t>
+      </w:r>
+      <w:r>
+        <w:rPr>
+          <w:lang w:val="en-US"/>
+        </w:rPr>
+        <w:t xml:space="preserve">operational </w:t>
+      </w:r>
+      <w:r>
+        <w:rPr>
+          <w:lang w:val="en-US"/>
+        </w:rPr>
+        <w:t xml:space="preserve">system’s requirements in terms of </w:t>
+      </w:r>
+      <w:r>
+        <w:rPr>
+          <w:lang w:val="en-US"/>
+        </w:rPr>
+        <w:t xml:space="preserve">Installation/Deployment/Delivery/Configuration </w:t>
+      </w:r>
+      <w:r>
+        <w:rPr>
+          <w:lang w:val="en-US"/>
+        </w:rPr>
+        <w:t>could be written as follow “</w:t>
+      </w:r>
+      <w:r>
+        <w:rPr>
+          <w:lang w:val="en-US"/>
+        </w:rPr>
+        <w:t>RO</w:t>
+      </w:r>
+      <w:r>
+        <w:rPr>
+          <w:lang w:val="en-US"/>
+        </w:rPr>
+        <w:t>001 –</w:t>
+      </w:r>
+      <w:r>
+        <w:rPr>
+          <w:lang w:val="en-US"/>
+        </w:rPr>
         <w:t xml:space="preserve"> </w:t>
       </w:r>
       <w:r>
         <w:rPr>
           <w:lang w:val="en-US"/>
         </w:rPr>
-        <w:t>T</w:t>
-      </w:r>
-      <w:r>
-        <w:rPr>
-          <w:lang w:val="en-US"/>
-        </w:rPr>
-        <w:t xml:space="preserve">hanks to the application of a RUPP’s boilerplate, </w:t>
-      </w:r>
-      <w:r>
-        <w:rPr>
-          <w:lang w:val="en-US"/>
-        </w:rPr>
-        <w:t>three</w:t>
-      </w:r>
-      <w:r>
-        <w:rPr>
-          <w:lang w:val="en-US"/>
-        </w:rPr>
-        <w:t xml:space="preserve"> corresponding </w:t>
-      </w:r>
-      <w:r>
-        <w:rPr>
-          <w:lang w:val="en-US"/>
-        </w:rPr>
-        <w:t xml:space="preserve">system’s </w:t>
-      </w:r>
-      <w:r>
-        <w:rPr>
-          <w:lang w:val="en-US"/>
-        </w:rPr>
-        <w:t>requirement</w:t>
-      </w:r>
-      <w:r>
-        <w:rPr>
-          <w:lang w:val="en-US"/>
-        </w:rPr>
-        <w:t>s</w:t>
+        <w:t xml:space="preserve">While the </w:t>
+      </w:r>
+      <w:r>
+        <w:rPr>
+          <w:lang w:val="en-US"/>
+        </w:rPr>
+        <w:t>Workshop A’s DTS</w:t>
+      </w:r>
+      <w:r>
+        <w:rPr>
+          <w:lang w:val="en-US"/>
+        </w:rPr>
+        <w:t xml:space="preserve"> is deployed, delivered and configured, any </w:t>
+      </w:r>
+      <w:r>
+        <w:rPr>
+          <w:lang w:val="en-US"/>
+        </w:rPr>
+        <w:t>Workshop A’s DTS</w:t>
+      </w:r>
+      <w:r>
+        <w:rPr>
+          <w:lang w:val="en-US"/>
+        </w:rPr>
+        <w:t xml:space="preserve">’ version of </w:t>
+      </w:r>
+      <w:r>
+        <w:rPr>
+          <w:lang w:val="en-US"/>
+        </w:rPr>
+        <w:t xml:space="preserve">any Modeling &amp; Simulation’s sub-project composing </w:t>
+      </w:r>
+      <w:r>
+        <w:rPr>
+          <w:lang w:val="en-US"/>
+        </w:rPr>
+        <w:t>it</w:t>
       </w:r>
       <w:r>
         <w:rPr>
@@ -512,86 +1188,45 @@
         <w:rPr>
           <w:lang w:val="en-US"/>
         </w:rPr>
-        <w:t xml:space="preserve">in terms of Interface </w:t>
-      </w:r>
-      <w:r>
-        <w:rPr>
-          <w:lang w:val="en-US"/>
-        </w:rPr>
-        <w:t xml:space="preserve">could be </w:t>
-      </w:r>
-      <w:r>
-        <w:rPr>
-          <w:lang w:val="en-US"/>
-        </w:rPr>
-        <w:t xml:space="preserve">written as follow </w:t>
-      </w:r>
-      <w:r>
-        <w:rPr>
-          <w:lang w:val="en-US"/>
-        </w:rPr>
-        <w:t>“E</w:t>
-      </w:r>
-      <w:r>
-        <w:rPr>
-          <w:lang w:val="en-US"/>
-        </w:rPr>
-        <w:t>T001</w:t>
-      </w:r>
-      <w:r>
-        <w:rPr>
-          <w:lang w:val="en-US"/>
-        </w:rPr>
-        <w:t xml:space="preserve"> – </w:t>
-      </w:r>
-      <w:r>
-        <w:rPr>
-          <w:lang w:val="en-US"/>
-        </w:rPr>
-        <w:t>The Workshop A’s DTS should provide the user with the ability to use in a highly intuitive way the HMI dedicated to the simulation</w:t>
-      </w:r>
-      <w:r>
-        <w:rPr>
-          <w:lang w:val="en-US"/>
-        </w:rPr>
-        <w:t>.</w:t>
-      </w:r>
-      <w:r>
-        <w:rPr>
-          <w:lang w:val="en-US"/>
-        </w:rPr>
-        <w:t>”</w:t>
-      </w:r>
-      <w:r>
-        <w:rPr>
-          <w:lang w:val="en-US"/>
-        </w:rPr>
-        <w:t xml:space="preserve">, “ET002 – </w:t>
-      </w:r>
-      <w:r>
-        <w:rPr>
-          <w:lang w:val="en-US"/>
-        </w:rPr>
-        <w:t>The Workshop A’s DTS shall provide the user with the ability to use in a very simple and intuitive way the HMI dedicated to the visualization of the data contained in the database of products orders</w:t>
-      </w:r>
-      <w:r>
-        <w:rPr>
-          <w:lang w:val="en-US"/>
-        </w:rPr>
-        <w:t>.” and “</w:t>
-      </w:r>
-      <w:r>
-        <w:rPr>
-          <w:lang w:val="en-US"/>
-        </w:rPr>
-        <w:t>The Workshop A’s DTS shall provide the user with the ability to use in a very simple and intuitive way the HMI dedicated to the visualization of the data contained in the database of energy loading</w:t>
-      </w:r>
-      <w:r>
-        <w:rPr>
-          <w:lang w:val="en-US"/>
-        </w:rPr>
-        <w:t>.”.</w:t>
-      </w:r>
+        <w:t>shall</w:t>
+      </w:r>
+      <w:r>
+        <w:rPr>
+          <w:lang w:val="en-US"/>
+        </w:rPr>
+        <w:t xml:space="preserve"> be stored and accessible for any update-related modifications within a </w:t>
+      </w:r>
+      <w:r>
+        <w:rPr>
+          <w:lang w:val="en-US"/>
+        </w:rPr>
+        <w:t xml:space="preserve">central </w:t>
+      </w:r>
+      <w:r>
+        <w:rPr>
+          <w:lang w:val="en-US"/>
+        </w:rPr>
+        <w:t>repository</w:t>
+      </w:r>
+      <w:r>
+        <w:rPr>
+          <w:lang w:val="en-US"/>
+        </w:rPr>
+        <w:t xml:space="preserve"> </w:t>
+      </w:r>
+      <w:r>
+        <w:rPr>
+          <w:lang w:val="en-US"/>
+        </w:rPr>
+        <w:t>”.</w:t>
+      </w:r>
+    </w:p>
+    <w:p>
+      <w:pPr>
+        <w:rPr>
+          <w:lang w:val="en-US"/>
+        </w:rPr>
+      </w:pPr>
     </w:p>
     <w:p>
       <w:pPr>
@@ -1213,6 +1848,7 @@
   <w:style w:type="character" w:default="1" w:styleId="Policepardfaut">
     <w:name w:val="Default Paragraph Font"/>
     <w:uiPriority w:val="1"/>
+    <w:semiHidden/>
     <w:unhideWhenUsed/>
   </w:style>
   <w:style w:type="table" w:default="1" w:styleId="TableauNormal">

</xml_diff>

<commit_message>
Adding a MQTT Architectural pattern for DTS-related systems interoperability management within the RECP
</commit_message>
<xml_diff>
--- a/recp/PatternsRECPLevelData/PatternsDiagramImages/MockRECP/Nouveau Document Microsoft Word.docx
+++ b/recp/PatternsRECPLevelData/PatternsDiagramImages/MockRECP/Nouveau Document Microsoft Word.docx
@@ -689,19 +689,21 @@
         <w:rPr>
           <w:lang w:val="en-US"/>
         </w:rPr>
-        <w:t xml:space="preserve"> Applying a </w:t>
-      </w:r>
-      <w:r>
-        <w:rPr>
-          <w:lang w:val="en-US"/>
-        </w:rPr>
-        <w:t>EARS’</w:t>
-      </w:r>
-      <w:r>
-        <w:rPr>
-          <w:lang w:val="en-US"/>
-        </w:rPr>
-        <w:t xml:space="preserve"> boilerplate adapted to the case of DTS’ Engineering</w:t>
+        <w:t xml:space="preserve"> Applying </w:t>
+      </w:r>
+      <w:proofErr w:type="gramStart"/>
+      <w:r>
+        <w:rPr>
+          <w:lang w:val="en-US"/>
+        </w:rPr>
+        <w:t>a</w:t>
+      </w:r>
+      <w:proofErr w:type="gramEnd"/>
+      <w:r>
+        <w:rPr>
+          <w:lang w:val="en-US"/>
+        </w:rPr>
+        <w:t xml:space="preserve"> EARS’ boilerplate adapted to the case of DTS’ Engineering</w:t>
       </w:r>
     </w:p>
     <w:p>
@@ -820,19 +822,7 @@
         <w:rPr>
           <w:lang w:val="en-US"/>
         </w:rPr>
-        <w:t xml:space="preserve">All the stakeholders want the </w:t>
-      </w:r>
-      <w:r>
-        <w:rPr>
-          <w:lang w:val="en-US"/>
-        </w:rPr>
-        <w:t>Workshop A</w:t>
-      </w:r>
-      <w:r>
-        <w:rPr>
-          <w:lang w:val="en-US"/>
-        </w:rPr>
-        <w:t>’s DTS to be easy to evolve</w:t>
+        <w:t>All the stakeholders want the Workshop A’s DTS to be easy to evolve</w:t>
       </w:r>
       <w:r>
         <w:rPr>
@@ -910,19 +900,7 @@
         <w:rPr>
           <w:lang w:val="en-US"/>
         </w:rPr>
-        <w:t xml:space="preserve">The </w:t>
-      </w:r>
-      <w:r>
-        <w:rPr>
-          <w:lang w:val="en-US"/>
-        </w:rPr>
-        <w:t>Workshop A’s DTS</w:t>
-      </w:r>
-      <w:r>
-        <w:rPr>
-          <w:lang w:val="en-US"/>
-        </w:rPr>
-        <w:t xml:space="preserve"> shall be easy to evolve</w:t>
+        <w:t>The Workshop A’s DTS shall be easy to evolve</w:t>
       </w:r>
       <w:r>
         <w:rPr>
@@ -1050,7 +1028,85 @@
         <w:rPr>
           <w:lang w:val="en-US"/>
         </w:rPr>
-        <w:t xml:space="preserve">The Company wants any version of any Modeling &amp; Simulation’s sub-project composing the </w:t>
+        <w:t>The Company wants any version of any Modeling &amp; Simulation’s sub-project composing the Workshop A’s DTS to be stored and accessible for any update-related modifications within a repository</w:t>
+      </w:r>
+      <w:r>
+        <w:rPr>
+          <w:lang w:val="en-US"/>
+        </w:rPr>
+        <w:t>”. Thanks to the application of a</w:t>
+      </w:r>
+      <w:r>
+        <w:rPr>
+          <w:lang w:val="en-US"/>
+        </w:rPr>
+        <w:t>n EARS’</w:t>
+      </w:r>
+      <w:r>
+        <w:rPr>
+          <w:lang w:val="en-US"/>
+        </w:rPr>
+        <w:t xml:space="preserve"> boilerplate, </w:t>
+      </w:r>
+      <w:r>
+        <w:rPr>
+          <w:lang w:val="en-US"/>
+        </w:rPr>
+        <w:t>a</w:t>
+      </w:r>
+      <w:r>
+        <w:rPr>
+          <w:lang w:val="en-US"/>
+        </w:rPr>
+        <w:t xml:space="preserve"> corresponding </w:t>
+      </w:r>
+      <w:r>
+        <w:rPr>
+          <w:lang w:val="en-US"/>
+        </w:rPr>
+        <w:t xml:space="preserve">operational </w:t>
+      </w:r>
+      <w:r>
+        <w:rPr>
+          <w:lang w:val="en-US"/>
+        </w:rPr>
+        <w:t xml:space="preserve">system’s requirements in terms of </w:t>
+      </w:r>
+      <w:r>
+        <w:rPr>
+          <w:lang w:val="en-US"/>
+        </w:rPr>
+        <w:t xml:space="preserve">Installation/Deployment/Delivery/Configuration </w:t>
+      </w:r>
+      <w:r>
+        <w:rPr>
+          <w:lang w:val="en-US"/>
+        </w:rPr>
+        <w:t>could be written as follow “</w:t>
+      </w:r>
+      <w:r>
+        <w:rPr>
+          <w:lang w:val="en-US"/>
+        </w:rPr>
+        <w:t>RO</w:t>
+      </w:r>
+      <w:r>
+        <w:rPr>
+          <w:lang w:val="en-US"/>
+        </w:rPr>
+        <w:t>001 –</w:t>
+      </w:r>
+      <w:r>
+        <w:rPr>
+          <w:lang w:val="en-US"/>
+        </w:rPr>
+        <w:t xml:space="preserve"> </w:t>
+      </w:r>
+      <w:r>
+        <w:rPr>
+          <w:lang w:val="en-US"/>
+        </w:rPr>
+        <w:t xml:space="preserve">While the </w:t>
       </w:r>
       <w:r>
         <w:rPr>
@@ -1062,157 +1118,7 @@
         <w:rPr>
           <w:lang w:val="en-US"/>
         </w:rPr>
-        <w:t xml:space="preserve"> to be stored and accessible for any update-related modifications within a repository</w:t>
-      </w:r>
-      <w:r>
-        <w:rPr>
-          <w:lang w:val="en-US"/>
-        </w:rPr>
-        <w:t>”. Thanks to the application of a</w:t>
-      </w:r>
-      <w:r>
-        <w:rPr>
-          <w:lang w:val="en-US"/>
-        </w:rPr>
-        <w:t>n EARS’</w:t>
-      </w:r>
-      <w:r>
-        <w:rPr>
-          <w:lang w:val="en-US"/>
-        </w:rPr>
-        <w:t xml:space="preserve"> boilerplate, </w:t>
-      </w:r>
-      <w:r>
-        <w:rPr>
-          <w:lang w:val="en-US"/>
-        </w:rPr>
-        <w:t>a</w:t>
-      </w:r>
-      <w:r>
-        <w:rPr>
-          <w:lang w:val="en-US"/>
-        </w:rPr>
-        <w:t xml:space="preserve"> corresponding </w:t>
-      </w:r>
-      <w:r>
-        <w:rPr>
-          <w:lang w:val="en-US"/>
-        </w:rPr>
-        <w:t xml:space="preserve">operational </w:t>
-      </w:r>
-      <w:r>
-        <w:rPr>
-          <w:lang w:val="en-US"/>
-        </w:rPr>
-        <w:t xml:space="preserve">system’s requirements in terms of </w:t>
-      </w:r>
-      <w:r>
-        <w:rPr>
-          <w:lang w:val="en-US"/>
-        </w:rPr>
-        <w:t xml:space="preserve">Installation/Deployment/Delivery/Configuration </w:t>
-      </w:r>
-      <w:r>
-        <w:rPr>
-          <w:lang w:val="en-US"/>
-        </w:rPr>
-        <w:t>could be written as follow “</w:t>
-      </w:r>
-      <w:r>
-        <w:rPr>
-          <w:lang w:val="en-US"/>
-        </w:rPr>
-        <w:t>RO</w:t>
-      </w:r>
-      <w:r>
-        <w:rPr>
-          <w:lang w:val="en-US"/>
-        </w:rPr>
-        <w:t>001 –</w:t>
-      </w:r>
-      <w:r>
-        <w:rPr>
-          <w:lang w:val="en-US"/>
-        </w:rPr>
-        <w:t xml:space="preserve"> </w:t>
-      </w:r>
-      <w:r>
-        <w:rPr>
-          <w:lang w:val="en-US"/>
-        </w:rPr>
-        <w:t xml:space="preserve">While the </w:t>
-      </w:r>
-      <w:r>
-        <w:rPr>
-          <w:lang w:val="en-US"/>
-        </w:rPr>
-        <w:t>Workshop A’s DTS</w:t>
-      </w:r>
-      <w:r>
-        <w:rPr>
-          <w:lang w:val="en-US"/>
-        </w:rPr>
-        <w:t xml:space="preserve"> is deployed, delivered and configured, any </w:t>
-      </w:r>
-      <w:r>
-        <w:rPr>
-          <w:lang w:val="en-US"/>
-        </w:rPr>
-        <w:t>Workshop A’s DTS</w:t>
-      </w:r>
-      <w:r>
-        <w:rPr>
-          <w:lang w:val="en-US"/>
-        </w:rPr>
-        <w:t xml:space="preserve">’ version of </w:t>
-      </w:r>
-      <w:r>
-        <w:rPr>
-          <w:lang w:val="en-US"/>
-        </w:rPr>
-        <w:t xml:space="preserve">any Modeling &amp; Simulation’s sub-project composing </w:t>
-      </w:r>
-      <w:r>
-        <w:rPr>
-          <w:lang w:val="en-US"/>
-        </w:rPr>
-        <w:t>it</w:t>
-      </w:r>
-      <w:r>
-        <w:rPr>
-          <w:lang w:val="en-US"/>
-        </w:rPr>
-        <w:t xml:space="preserve"> </w:t>
-      </w:r>
-      <w:r>
-        <w:rPr>
-          <w:lang w:val="en-US"/>
-        </w:rPr>
-        <w:t>shall</w:t>
-      </w:r>
-      <w:r>
-        <w:rPr>
-          <w:lang w:val="en-US"/>
-        </w:rPr>
-        <w:t xml:space="preserve"> be stored and accessible for any update-related modifications within a </w:t>
-      </w:r>
-      <w:r>
-        <w:rPr>
-          <w:lang w:val="en-US"/>
-        </w:rPr>
-        <w:t xml:space="preserve">central </w:t>
-      </w:r>
-      <w:r>
-        <w:rPr>
-          <w:lang w:val="en-US"/>
-        </w:rPr>
-        <w:t>repository</w:t>
-      </w:r>
-      <w:r>
-        <w:rPr>
-          <w:lang w:val="en-US"/>
-        </w:rPr>
-        <w:t xml:space="preserve"> </w:t>
+        <w:t xml:space="preserve"> is deployed, delivered and configured, any Workshop A’s DTS’ version of any Modeling &amp; Simulation’s sub-project composing it shall be stored and accessible for any update-related modifications within a central repository </w:t>
       </w:r>
       <w:r>
         <w:rPr>
@@ -1223,6 +1129,9 @@
     </w:p>
     <w:p>
       <w:pPr>
+        <w:pBdr>
+          <w:bottom w:val="double" w:sz="6" w:space="1" w:color="auto"/>
+        </w:pBdr>
         <w:rPr>
           <w:lang w:val="en-US"/>
         </w:rPr>
@@ -1231,9 +1140,892 @@
     <w:p>
       <w:pPr>
         <w:rPr>
+          <w:b/>
+          <w:bCs/>
           <w:lang w:val="en-US"/>
         </w:rPr>
       </w:pPr>
+      <w:r>
+        <w:rPr>
+          <w:b/>
+          <w:bCs/>
+          <w:lang w:val="en-US"/>
+        </w:rPr>
+        <w:t>MQTT Architectural pattern for DTS-related systems interoperability man</w:t>
+      </w:r>
+      <w:r>
+        <w:rPr>
+          <w:b/>
+          <w:bCs/>
+          <w:lang w:val="en-US"/>
+        </w:rPr>
+        <w:t>a</w:t>
+      </w:r>
+      <w:r>
+        <w:rPr>
+          <w:b/>
+          <w:bCs/>
+          <w:lang w:val="en-US"/>
+        </w:rPr>
+        <w:t>gement</w:t>
+      </w:r>
+    </w:p>
+    <w:p>
+      <w:pPr>
+        <w:rPr>
+          <w:lang w:val="en-US"/>
+        </w:rPr>
+      </w:pPr>
+      <w:r>
+        <w:rPr>
+          <w:b/>
+          <w:bCs/>
+          <w:lang w:val="en-US"/>
+        </w:rPr>
+        <w:t>Problem </w:t>
+      </w:r>
+      <w:r>
+        <w:rPr>
+          <w:b/>
+          <w:bCs/>
+          <w:lang w:val="en-US"/>
+        </w:rPr>
+        <w:t>Statement</w:t>
+      </w:r>
+      <w:r>
+        <w:rPr>
+          <w:b/>
+          <w:bCs/>
+          <w:lang w:val="en-US"/>
+        </w:rPr>
+        <w:t xml:space="preserve">: </w:t>
+      </w:r>
+      <w:r>
+        <w:rPr>
+          <w:lang w:val="en-US"/>
+        </w:rPr>
+        <w:t>Designing logical</w:t>
+      </w:r>
+      <w:r>
+        <w:rPr>
+          <w:lang w:val="en-US"/>
+        </w:rPr>
+        <w:t>/physical architectures</w:t>
+      </w:r>
+      <w:r>
+        <w:rPr>
+          <w:b/>
+          <w:bCs/>
+          <w:lang w:val="en-US"/>
+        </w:rPr>
+        <w:t xml:space="preserve"> </w:t>
+      </w:r>
+      <w:r>
+        <w:rPr>
+          <w:lang w:val="en-US"/>
+        </w:rPr>
+        <w:t xml:space="preserve">where the elements involved in/during the engineering of a DTS (tools, sub-systems, sub-systems of DTS’ sub-systems…) can communicate and exchange data between them. </w:t>
+      </w:r>
+    </w:p>
+    <w:p>
+      <w:pPr>
+        <w:rPr>
+          <w:lang w:val="en-US"/>
+        </w:rPr>
+      </w:pPr>
+      <w:r>
+        <w:rPr>
+          <w:b/>
+          <w:bCs/>
+          <w:lang w:val="en-US"/>
+        </w:rPr>
+        <w:t>Solution</w:t>
+      </w:r>
+      <w:r>
+        <w:rPr>
+          <w:b/>
+          <w:bCs/>
+          <w:lang w:val="en-US"/>
+        </w:rPr>
+        <w:t xml:space="preserve"> Statement</w:t>
+      </w:r>
+      <w:r>
+        <w:rPr>
+          <w:b/>
+          <w:bCs/>
+          <w:lang w:val="en-US"/>
+        </w:rPr>
+        <w:t>:</w:t>
+      </w:r>
+      <w:r>
+        <w:rPr>
+          <w:lang w:val="en-US"/>
+        </w:rPr>
+        <w:t xml:space="preserve"> Applying </w:t>
+      </w:r>
+      <w:r>
+        <w:rPr>
+          <w:lang w:val="en-US"/>
+        </w:rPr>
+        <w:t>a</w:t>
+      </w:r>
+      <w:r>
+        <w:rPr>
+          <w:lang w:val="en-US"/>
+        </w:rPr>
+        <w:t xml:space="preserve"> DTS-specific</w:t>
+      </w:r>
+      <w:r>
+        <w:rPr>
+          <w:lang w:val="en-US"/>
+        </w:rPr>
+        <w:t xml:space="preserve"> architectural pattern inspired by a basic MQTT-based architecture and protocol (subscribe/publish)</w:t>
+      </w:r>
+      <w:r>
+        <w:rPr>
+          <w:lang w:val="en-US"/>
+        </w:rPr>
+        <w:t xml:space="preserve"> but adapted accordingly. </w:t>
+      </w:r>
+      <w:r>
+        <w:rPr>
+          <w:lang w:val="en-US"/>
+        </w:rPr>
+        <w:t xml:space="preserve"> </w:t>
+      </w:r>
+    </w:p>
+    <w:p>
+      <w:pPr>
+        <w:rPr>
+          <w:lang w:val="en-US"/>
+        </w:rPr>
+      </w:pPr>
+      <w:r>
+        <w:rPr>
+          <w:b/>
+          <w:bCs/>
+          <w:lang w:val="en-US"/>
+        </w:rPr>
+        <w:t>Situation from which the pattern was deduced</w:t>
+      </w:r>
+      <w:r>
+        <w:rPr>
+          <w:b/>
+          <w:bCs/>
+          <w:lang w:val="en-US"/>
+        </w:rPr>
+        <w:t>:</w:t>
+      </w:r>
+      <w:r>
+        <w:rPr>
+          <w:lang w:val="en-US"/>
+        </w:rPr>
+        <w:t xml:space="preserve"> The pattern was deduced from a </w:t>
+      </w:r>
+      <w:r>
+        <w:rPr>
+          <w:lang w:val="en-US"/>
+        </w:rPr>
+        <w:t xml:space="preserve">very simple workshop’s </w:t>
+      </w:r>
+      <w:r>
+        <w:rPr>
+          <w:lang w:val="en-US"/>
+        </w:rPr>
+        <w:t xml:space="preserve">DTS engineering project. More concretely, it was needed to make it possible to command the type of resource received as an input of a </w:t>
+      </w:r>
+      <w:r>
+        <w:rPr>
+          <w:lang w:val="en-US"/>
+        </w:rPr>
+        <w:t xml:space="preserve">Workshop Source of </w:t>
+      </w:r>
+      <w:r>
+        <w:rPr>
+          <w:lang w:val="en-US"/>
+        </w:rPr>
+        <w:t xml:space="preserve">simulation model under </w:t>
+      </w:r>
+      <w:proofErr w:type="spellStart"/>
+      <w:r>
+        <w:rPr>
+          <w:lang w:val="en-US"/>
+        </w:rPr>
+        <w:t>Tecnomatix</w:t>
+      </w:r>
+      <w:proofErr w:type="spellEnd"/>
+      <w:r>
+        <w:rPr>
+          <w:lang w:val="en-US"/>
+        </w:rPr>
+        <w:t xml:space="preserve"> </w:t>
+      </w:r>
+      <w:proofErr w:type="spellStart"/>
+      <w:r>
+        <w:rPr>
+          <w:lang w:val="en-US"/>
+        </w:rPr>
+        <w:t>PlantSimulation</w:t>
+      </w:r>
+      <w:proofErr w:type="spellEnd"/>
+      <w:r>
+        <w:rPr>
+          <w:lang w:val="en-US"/>
+        </w:rPr>
+        <w:t xml:space="preserve"> from an external </w:t>
+      </w:r>
+      <w:proofErr w:type="spellStart"/>
+      <w:r>
+        <w:rPr>
+          <w:lang w:val="en-US"/>
+        </w:rPr>
+        <w:t>Ingescape</w:t>
+      </w:r>
+      <w:proofErr w:type="spellEnd"/>
+      <w:r>
+        <w:rPr>
+          <w:lang w:val="en-US"/>
+        </w:rPr>
+        <w:t xml:space="preserve"> Agent. To do so, a </w:t>
+      </w:r>
+      <w:proofErr w:type="spellStart"/>
+      <w:r>
+        <w:rPr>
+          <w:lang w:val="en-US"/>
+        </w:rPr>
+        <w:t>HiveMq</w:t>
+      </w:r>
+      <w:proofErr w:type="spellEnd"/>
+      <w:r>
+        <w:rPr>
+          <w:lang w:val="en-US"/>
+        </w:rPr>
+        <w:t xml:space="preserve"> MQTT Broker was first encapsulated as an </w:t>
+      </w:r>
+      <w:proofErr w:type="spellStart"/>
+      <w:r>
+        <w:rPr>
+          <w:lang w:val="en-US"/>
+        </w:rPr>
+        <w:t>Ingescape</w:t>
+      </w:r>
+      <w:proofErr w:type="spellEnd"/>
+      <w:r>
+        <w:rPr>
+          <w:lang w:val="en-US"/>
+        </w:rPr>
+        <w:t xml:space="preserve"> Agent. Then, a topic dedicated to this </w:t>
+      </w:r>
+      <w:r>
+        <w:rPr>
+          <w:lang w:val="en-US"/>
+        </w:rPr>
+        <w:t>type of input</w:t>
+      </w:r>
+      <w:r>
+        <w:rPr>
+          <w:lang w:val="en-US"/>
+        </w:rPr>
+        <w:t xml:space="preserve"> was added within this broker agent and both the </w:t>
+      </w:r>
+      <w:proofErr w:type="spellStart"/>
+      <w:r>
+        <w:rPr>
+          <w:lang w:val="en-US"/>
+        </w:rPr>
+        <w:t>Ingescape</w:t>
+      </w:r>
+      <w:proofErr w:type="spellEnd"/>
+      <w:r>
+        <w:rPr>
+          <w:lang w:val="en-US"/>
+        </w:rPr>
+        <w:t xml:space="preserve"> agent and simulation model had to subscribe to this topic. Once a type of input was specified by the </w:t>
+      </w:r>
+      <w:proofErr w:type="spellStart"/>
+      <w:r>
+        <w:rPr>
+          <w:lang w:val="en-US"/>
+        </w:rPr>
+        <w:t>Ingescape</w:t>
+      </w:r>
+      <w:proofErr w:type="spellEnd"/>
+      <w:r>
+        <w:rPr>
+          <w:lang w:val="en-US"/>
+        </w:rPr>
+        <w:t xml:space="preserve"> Agent through a </w:t>
+      </w:r>
+      <w:proofErr w:type="gramStart"/>
+      <w:r>
+        <w:rPr>
+          <w:lang w:val="en-US"/>
+        </w:rPr>
+        <w:t>publish</w:t>
+      </w:r>
+      <w:proofErr w:type="gramEnd"/>
+      <w:r>
+        <w:rPr>
+          <w:lang w:val="en-US"/>
+        </w:rPr>
+        <w:t xml:space="preserve"> action</w:t>
+      </w:r>
+      <w:r>
+        <w:rPr>
+          <w:lang w:val="en-US"/>
+        </w:rPr>
+        <w:t xml:space="preserve"> using this topic</w:t>
+      </w:r>
+      <w:r>
+        <w:rPr>
+          <w:lang w:val="en-US"/>
+        </w:rPr>
+        <w:t xml:space="preserve">, the broker transmitted the appropriate message to the simulation model. As a response, this latter changed its type of input accordingly.      </w:t>
+      </w:r>
+    </w:p>
+    <w:p>
+      <w:pPr>
+        <w:rPr>
+          <w:lang w:val="en-US"/>
+        </w:rPr>
+      </w:pPr>
+    </w:p>
+    <w:p>
+      <w:pPr>
+        <w:rPr>
+          <w:lang w:val="en-US"/>
+        </w:rPr>
+      </w:pPr>
+      <w:r>
+        <w:rPr>
+          <w:b/>
+          <w:bCs/>
+          <w:lang w:val="en-US"/>
+        </w:rPr>
+        <w:t>Example Of Application Statements 1:</w:t>
+      </w:r>
+      <w:r>
+        <w:rPr>
+          <w:lang w:val="en-US"/>
+        </w:rPr>
+        <w:t xml:space="preserve"> </w:t>
+      </w:r>
+      <w:r>
+        <w:rPr>
+          <w:lang w:val="en-US"/>
+        </w:rPr>
+        <w:t xml:space="preserve">[From a </w:t>
+      </w:r>
+      <w:r>
+        <w:rPr>
+          <w:lang w:val="en-US"/>
+        </w:rPr>
+        <w:t>logical</w:t>
+      </w:r>
+      <w:r>
+        <w:rPr>
+          <w:lang w:val="en-US"/>
+        </w:rPr>
+        <w:t xml:space="preserve"> architecture view]</w:t>
+      </w:r>
+      <w:r>
+        <w:rPr>
+          <w:lang w:val="en-US"/>
+        </w:rPr>
+        <w:t xml:space="preserve"> </w:t>
+      </w:r>
+      <w:r>
+        <w:rPr>
+          <w:lang w:val="en-US"/>
+        </w:rPr>
+        <w:t>The project took place in the frame of</w:t>
+      </w:r>
+      <w:r>
+        <w:rPr>
+          <w:lang w:val="en-US"/>
+        </w:rPr>
+        <w:t xml:space="preserve"> </w:t>
+      </w:r>
+      <w:r>
+        <w:rPr>
+          <w:lang w:val="en-US"/>
+        </w:rPr>
+        <w:t xml:space="preserve">a very simple </w:t>
+      </w:r>
+      <w:r>
+        <w:rPr>
+          <w:lang w:val="en-US"/>
+        </w:rPr>
+        <w:t xml:space="preserve">workshop’s DTS engineering project. </w:t>
+      </w:r>
+      <w:r>
+        <w:rPr>
+          <w:lang w:val="en-US"/>
+        </w:rPr>
+        <w:t xml:space="preserve">It </w:t>
+      </w:r>
+      <w:r>
+        <w:rPr>
+          <w:lang w:val="en-US"/>
+        </w:rPr>
+        <w:t xml:space="preserve">was needed to make it possible to command the type of resource received as an input of a Workshop Source of simulation model under </w:t>
+      </w:r>
+      <w:proofErr w:type="spellStart"/>
+      <w:r>
+        <w:rPr>
+          <w:lang w:val="en-US"/>
+        </w:rPr>
+        <w:t>Tecnomatix</w:t>
+      </w:r>
+      <w:proofErr w:type="spellEnd"/>
+      <w:r>
+        <w:rPr>
+          <w:lang w:val="en-US"/>
+        </w:rPr>
+        <w:t xml:space="preserve"> </w:t>
+      </w:r>
+      <w:proofErr w:type="spellStart"/>
+      <w:r>
+        <w:rPr>
+          <w:lang w:val="en-US"/>
+        </w:rPr>
+        <w:t>PlantSimulation</w:t>
+      </w:r>
+      <w:proofErr w:type="spellEnd"/>
+      <w:r>
+        <w:rPr>
+          <w:lang w:val="en-US"/>
+        </w:rPr>
+        <w:t xml:space="preserve"> from an external </w:t>
+      </w:r>
+      <w:proofErr w:type="spellStart"/>
+      <w:r>
+        <w:rPr>
+          <w:lang w:val="en-US"/>
+        </w:rPr>
+        <w:t>Ingescape</w:t>
+      </w:r>
+      <w:proofErr w:type="spellEnd"/>
+      <w:r>
+        <w:rPr>
+          <w:lang w:val="en-US"/>
+        </w:rPr>
+        <w:t xml:space="preserve"> Agent.</w:t>
+      </w:r>
+      <w:r>
+        <w:rPr>
+          <w:lang w:val="en-US"/>
+        </w:rPr>
+        <w:t xml:space="preserve"> Like with any classical Systems &amp; Software Engineering (SSE)-based approach, the design of a logical architecture of the potential physical solution (Physical Architecture &amp; its implementation) is required.</w:t>
+      </w:r>
+      <w:r>
+        <w:rPr>
+          <w:lang w:val="en-US"/>
+        </w:rPr>
+        <w:t xml:space="preserve"> To do so, </w:t>
+      </w:r>
+      <w:r>
+        <w:rPr>
+          <w:lang w:val="en-US"/>
+        </w:rPr>
+        <w:t>motivated by a Federation of tools technique and inspiration</w:t>
+      </w:r>
+      <w:r>
+        <w:rPr>
+          <w:lang w:val="en-US"/>
+        </w:rPr>
+        <w:t xml:space="preserve"> and </w:t>
+      </w:r>
+      <w:r>
+        <w:rPr>
+          <w:lang w:val="en-US"/>
+        </w:rPr>
+        <w:t xml:space="preserve">under </w:t>
+      </w:r>
+      <w:proofErr w:type="spellStart"/>
+      <w:r>
+        <w:rPr>
+          <w:lang w:val="en-US"/>
+        </w:rPr>
+        <w:t>SysML</w:t>
+      </w:r>
+      <w:proofErr w:type="spellEnd"/>
+      <w:r>
+        <w:rPr>
+          <w:lang w:val="en-US"/>
+        </w:rPr>
+        <w:t xml:space="preserve"> </w:t>
+      </w:r>
+      <w:r>
+        <w:rPr>
+          <w:lang w:val="en-US"/>
+        </w:rPr>
+        <w:t xml:space="preserve">modeling </w:t>
+      </w:r>
+      <w:r>
+        <w:rPr>
+          <w:lang w:val="en-US"/>
+        </w:rPr>
+        <w:t xml:space="preserve">Language, a Block-Definition Diagram of a relevant candidate Logical Architecture inspired by the current Architectural Pattern could be described as </w:t>
+      </w:r>
+      <w:proofErr w:type="gramStart"/>
+      <w:r>
+        <w:rPr>
+          <w:lang w:val="en-US"/>
+        </w:rPr>
+        <w:t>follow</w:t>
+      </w:r>
+      <w:proofErr w:type="gramEnd"/>
+      <w:r>
+        <w:rPr>
+          <w:lang w:val="en-US"/>
+        </w:rPr>
+        <w:t>:</w:t>
+      </w:r>
+    </w:p>
+    <w:p>
+      <w:pPr>
+        <w:pStyle w:val="Paragraphedeliste"/>
+        <w:numPr>
+          <w:ilvl w:val="0"/>
+          <w:numId w:val="1"/>
+        </w:numPr>
+        <w:rPr>
+          <w:lang w:val="en-US"/>
+        </w:rPr>
+      </w:pPr>
+      <w:r>
+        <w:rPr>
+          <w:lang w:val="en-US"/>
+        </w:rPr>
+        <w:lastRenderedPageBreak/>
+        <w:t>By following the philosophy and best practice advised by the O (Open/Close) principle of the SOLID Principles, the DTS-related tools of Simulation model implementer and its corresponding orchestrator (which is also the orchestrator of the various components of the DTS) both implements the interface “</w:t>
+      </w:r>
+      <w:proofErr w:type="spellStart"/>
+      <w:r>
+        <w:rPr>
+          <w:lang w:val="en-US"/>
+        </w:rPr>
+        <w:t>ISubscriber</w:t>
+      </w:r>
+      <w:proofErr w:type="spellEnd"/>
+      <w:r>
+        <w:rPr>
+          <w:lang w:val="en-US"/>
+        </w:rPr>
+        <w:t>”. Moreover, the orchestrator also implements the interface “</w:t>
+      </w:r>
+      <w:proofErr w:type="spellStart"/>
+      <w:r>
+        <w:rPr>
+          <w:lang w:val="en-US"/>
+        </w:rPr>
+        <w:t>IPublisher</w:t>
+      </w:r>
+      <w:proofErr w:type="spellEnd"/>
+      <w:proofErr w:type="gramStart"/>
+      <w:r>
+        <w:rPr>
+          <w:lang w:val="en-US"/>
+        </w:rPr>
+        <w:t>”;</w:t>
+      </w:r>
+      <w:proofErr w:type="gramEnd"/>
+    </w:p>
+    <w:p>
+      <w:pPr>
+        <w:pStyle w:val="Paragraphedeliste"/>
+        <w:numPr>
+          <w:ilvl w:val="0"/>
+          <w:numId w:val="1"/>
+        </w:numPr>
+        <w:rPr>
+          <w:lang w:val="en-US"/>
+        </w:rPr>
+      </w:pPr>
+      <w:r>
+        <w:rPr>
+          <w:lang w:val="en-US"/>
+        </w:rPr>
+        <w:t>As the consequences of the</w:t>
+      </w:r>
+      <w:r>
+        <w:rPr>
+          <w:lang w:val="en-US"/>
+        </w:rPr>
+        <w:t xml:space="preserve"> previous actions, not only both tools are now considered as Clients of our MQTT broker (and therefore integrated within our whole architecture), but it’s now possible to the Simulation model implementer to subscribe to a topic on which the Orchestrator will publish the messages which will correspond to the type of input that should be taken into account for the Simulation execution. </w:t>
+      </w:r>
+      <w:r>
+        <w:rPr>
+          <w:lang w:val="en-US"/>
+        </w:rPr>
+        <w:t xml:space="preserve"> </w:t>
+      </w:r>
+      <w:r>
+        <w:rPr>
+          <w:lang w:val="en-US"/>
+        </w:rPr>
+        <w:t>In short, both tools are now communicating with each other.</w:t>
+      </w:r>
+    </w:p>
+    <w:p>
+      <w:pPr>
+        <w:rPr>
+          <w:lang w:val="en-US"/>
+        </w:rPr>
+      </w:pPr>
+      <w:r>
+        <w:rPr>
+          <w:b/>
+          <w:bCs/>
+          <w:lang w:val="en-US"/>
+        </w:rPr>
+        <w:t xml:space="preserve">Example Of Application Statements </w:t>
+      </w:r>
+      <w:r>
+        <w:rPr>
+          <w:b/>
+          <w:bCs/>
+          <w:lang w:val="en-US"/>
+        </w:rPr>
+        <w:t>2</w:t>
+      </w:r>
+      <w:r>
+        <w:rPr>
+          <w:b/>
+          <w:bCs/>
+          <w:lang w:val="en-US"/>
+        </w:rPr>
+        <w:t>:</w:t>
+      </w:r>
+      <w:r>
+        <w:rPr>
+          <w:lang w:val="en-US"/>
+        </w:rPr>
+        <w:t xml:space="preserve"> </w:t>
+      </w:r>
+      <w:r>
+        <w:rPr>
+          <w:lang w:val="en-US"/>
+        </w:rPr>
+        <w:t>[From a physical architecture view]</w:t>
+      </w:r>
+      <w:r>
+        <w:rPr>
+          <w:lang w:val="en-US"/>
+        </w:rPr>
+        <w:t xml:space="preserve"> </w:t>
+      </w:r>
+      <w:r>
+        <w:rPr>
+          <w:lang w:val="en-US"/>
+        </w:rPr>
+        <w:t>The project took place in the frame of</w:t>
+      </w:r>
+      <w:r>
+        <w:rPr>
+          <w:lang w:val="en-US"/>
+        </w:rPr>
+        <w:t xml:space="preserve"> </w:t>
+      </w:r>
+      <w:r>
+        <w:rPr>
+          <w:lang w:val="en-US"/>
+        </w:rPr>
+        <w:t xml:space="preserve">a very simple </w:t>
+      </w:r>
+      <w:r>
+        <w:rPr>
+          <w:lang w:val="en-US"/>
+        </w:rPr>
+        <w:t xml:space="preserve">workshop’s DTS engineering project. </w:t>
+      </w:r>
+      <w:r>
+        <w:rPr>
+          <w:lang w:val="en-US"/>
+        </w:rPr>
+        <w:t xml:space="preserve">It </w:t>
+      </w:r>
+      <w:r>
+        <w:rPr>
+          <w:lang w:val="en-US"/>
+        </w:rPr>
+        <w:t xml:space="preserve">was needed to make it possible to command the type of resource received as an input of a Workshop Source of simulation model under </w:t>
+      </w:r>
+      <w:proofErr w:type="spellStart"/>
+      <w:r>
+        <w:rPr>
+          <w:lang w:val="en-US"/>
+        </w:rPr>
+        <w:t>Tecnomatix</w:t>
+      </w:r>
+      <w:proofErr w:type="spellEnd"/>
+      <w:r>
+        <w:rPr>
+          <w:lang w:val="en-US"/>
+        </w:rPr>
+        <w:t xml:space="preserve"> </w:t>
+      </w:r>
+      <w:proofErr w:type="spellStart"/>
+      <w:r>
+        <w:rPr>
+          <w:lang w:val="en-US"/>
+        </w:rPr>
+        <w:t>PlantSimulation</w:t>
+      </w:r>
+      <w:proofErr w:type="spellEnd"/>
+      <w:r>
+        <w:rPr>
+          <w:lang w:val="en-US"/>
+        </w:rPr>
+        <w:t xml:space="preserve"> from an external </w:t>
+      </w:r>
+      <w:proofErr w:type="spellStart"/>
+      <w:r>
+        <w:rPr>
+          <w:lang w:val="en-US"/>
+        </w:rPr>
+        <w:t>Ingescape</w:t>
+      </w:r>
+      <w:proofErr w:type="spellEnd"/>
+      <w:r>
+        <w:rPr>
+          <w:lang w:val="en-US"/>
+        </w:rPr>
+        <w:t xml:space="preserve"> Agent. To do so, </w:t>
+      </w:r>
+      <w:r>
+        <w:rPr>
+          <w:lang w:val="en-US"/>
+        </w:rPr>
+        <w:t xml:space="preserve">motivated by a Federation of tools </w:t>
+      </w:r>
+      <w:r>
+        <w:rPr>
+          <w:lang w:val="en-US"/>
+        </w:rPr>
+        <w:t>technique and inspiration</w:t>
+      </w:r>
+      <w:r>
+        <w:rPr>
+          <w:lang w:val="en-US"/>
+        </w:rPr>
+        <w:t xml:space="preserve">, </w:t>
+      </w:r>
+      <w:r>
+        <w:rPr>
+          <w:lang w:val="en-US"/>
+        </w:rPr>
+        <w:t xml:space="preserve">a </w:t>
+      </w:r>
+      <w:proofErr w:type="spellStart"/>
+      <w:r>
+        <w:rPr>
+          <w:lang w:val="en-US"/>
+        </w:rPr>
+        <w:t>HiveMq</w:t>
+      </w:r>
+      <w:proofErr w:type="spellEnd"/>
+      <w:r>
+        <w:rPr>
+          <w:lang w:val="en-US"/>
+        </w:rPr>
+        <w:t xml:space="preserve"> MQTT Broker was first encapsulated as an </w:t>
+      </w:r>
+      <w:proofErr w:type="spellStart"/>
+      <w:r>
+        <w:rPr>
+          <w:lang w:val="en-US"/>
+        </w:rPr>
+        <w:t>Ingescape</w:t>
+      </w:r>
+      <w:proofErr w:type="spellEnd"/>
+      <w:r>
+        <w:rPr>
+          <w:lang w:val="en-US"/>
+        </w:rPr>
+        <w:t xml:space="preserve"> Agent. Then, a topic </w:t>
+      </w:r>
+      <w:r>
+        <w:rPr>
+          <w:lang w:val="en-US"/>
+        </w:rPr>
+        <w:t>named “</w:t>
+      </w:r>
+      <w:proofErr w:type="spellStart"/>
+      <w:r>
+        <w:rPr>
+          <w:lang w:val="en-US"/>
+        </w:rPr>
+        <w:t>M&amp;S_workshop_source_input_type</w:t>
+      </w:r>
+      <w:proofErr w:type="spellEnd"/>
+      <w:r>
+        <w:rPr>
+          <w:lang w:val="en-US"/>
+        </w:rPr>
+        <w:t xml:space="preserve">” and </w:t>
+      </w:r>
+      <w:r>
+        <w:rPr>
+          <w:lang w:val="en-US"/>
+        </w:rPr>
+        <w:t>dedicated to this type of input was added within this broker agent</w:t>
+      </w:r>
+      <w:r>
+        <w:rPr>
+          <w:lang w:val="en-US"/>
+        </w:rPr>
+        <w:t xml:space="preserve">. Then, </w:t>
+      </w:r>
+      <w:r>
+        <w:rPr>
+          <w:lang w:val="en-US"/>
+        </w:rPr>
+        <w:t xml:space="preserve">both the </w:t>
+      </w:r>
+      <w:proofErr w:type="spellStart"/>
+      <w:r>
+        <w:rPr>
+          <w:lang w:val="en-US"/>
+        </w:rPr>
+        <w:t>Ingescape</w:t>
+      </w:r>
+      <w:proofErr w:type="spellEnd"/>
+      <w:r>
+        <w:rPr>
+          <w:lang w:val="en-US"/>
+        </w:rPr>
+        <w:t xml:space="preserve"> agent and simulation model had to subscribe to this topic. Once a type of input was specified by the </w:t>
+      </w:r>
+      <w:proofErr w:type="spellStart"/>
+      <w:r>
+        <w:rPr>
+          <w:lang w:val="en-US"/>
+        </w:rPr>
+        <w:t>Ingescape</w:t>
+      </w:r>
+      <w:proofErr w:type="spellEnd"/>
+      <w:r>
+        <w:rPr>
+          <w:lang w:val="en-US"/>
+        </w:rPr>
+        <w:t xml:space="preserve"> Agent through a </w:t>
+      </w:r>
+      <w:proofErr w:type="gramStart"/>
+      <w:r>
+        <w:rPr>
+          <w:lang w:val="en-US"/>
+        </w:rPr>
+        <w:t>publish</w:t>
+      </w:r>
+      <w:proofErr w:type="gramEnd"/>
+      <w:r>
+        <w:rPr>
+          <w:lang w:val="en-US"/>
+        </w:rPr>
+        <w:t xml:space="preserve"> action using this topic, the broker transmitted the appropriate message to the simulation model. As a response, this latter changed its type of input accordingly.      </w:t>
+      </w:r>
     </w:p>
     <w:sectPr>
       <w:pgSz w:w="11906" w:h="16838"/>
@@ -1243,6 +2035,126 @@
     </w:sectPr>
   </w:body>
 </w:document>
+</file>
+
+<file path=word/numbering.xml><?xml version="1.0" encoding="utf-8"?>
+<w:numbering xmlns:wpc="http://schemas.microsoft.com/office/word/2010/wordprocessingCanvas" xmlns:cx="http://schemas.microsoft.com/office/drawing/2014/chartex" xmlns:cx1="http://schemas.microsoft.com/office/drawing/2015/9/8/chartex" xmlns:cx2="http://schemas.microsoft.com/office/drawing/2015/10/21/chartex" xmlns:cx3="http://schemas.microsoft.com/office/drawing/2016/5/9/chartex" xmlns:cx4="http://schemas.microsoft.com/office/drawing/2016/5/10/chartex" xmlns:cx5="http://schemas.microsoft.com/office/drawing/2016/5/11/chartex" xmlns:cx6="http://schemas.microsoft.com/office/drawing/2016/5/12/chartex" xmlns:cx7="http://schemas.microsoft.com/office/drawing/2016/5/13/chartex" xmlns:cx8="http://schemas.microsoft.com/office/drawing/2016/5/14/chartex" xmlns:mc="http://schemas.openxmlformats.org/markup-compatibility/2006" xmlns:aink="http://schemas.microsoft.com/office/drawing/2016/ink" xmlns:am3d="http://schemas.microsoft.com/office/drawing/2017/model3d" xmlns:o="urn:schemas-microsoft-com:office:office" xmlns:oel="http://schemas.microsoft.com/office/2019/extlst" xmlns:r="http://schemas.openxmlformats.org/officeDocument/2006/relationships" xmlns:m="http://schemas.openxmlformats.org/officeDocument/2006/math" xmlns:v="urn:schemas-microsoft-com:vml" xmlns:wp14="http://schemas.microsoft.com/office/word/2010/wordprocessingDrawing" xmlns:wp="http://schemas.openxmlformats.org/drawingml/2006/wordprocessingDrawing" xmlns:w10="urn:schemas-microsoft-com:office:word" xmlns:w="http://schemas.openxmlformats.org/wordprocessingml/2006/main" xmlns:w14="http://schemas.microsoft.com/office/word/2010/wordml" xmlns:w15="http://schemas.microsoft.com/office/word/2012/wordml" xmlns:w16cex="http://schemas.microsoft.com/office/word/2018/wordml/cex" xmlns:w16cid="http://schemas.microsoft.com/office/word/2016/wordml/cid" xmlns:w16="http://schemas.microsoft.com/office/word/2018/wordml" xmlns:w16du="http://schemas.microsoft.com/office/word/2023/wordml/word16du" xmlns:w16sdtdh="http://schemas.microsoft.com/office/word/2020/wordml/sdtdatahash" xmlns:w16sdtfl="http://schemas.microsoft.com/office/word/2024/wordml/sdtformatlock" xmlns:w16se="http://schemas.microsoft.com/office/word/2015/wordml/symex" xmlns:wpg="http://schemas.microsoft.com/office/word/2010/wordprocessingGroup" xmlns:wpi="http://schemas.microsoft.com/office/word/2010/wordprocessingInk" xmlns:wne="http://schemas.microsoft.com/office/word/2006/wordml" xmlns:wps="http://schemas.microsoft.com/office/word/2010/wordprocessingShape" mc:Ignorable="w14 w15 w16se w16cid w16 w16cex w16sdtdh w16sdtfl w16du wp14">
+  <w:abstractNum w:abstractNumId="0" w15:restartNumberingAfterBreak="0">
+    <w:nsid w:val="61CB7FAC"/>
+    <w:multiLevelType w:val="hybridMultilevel"/>
+    <w:tmpl w:val="3D2057A8"/>
+    <w:lvl w:ilvl="0" w:tplc="A1D058C0">
+      <w:numFmt w:val="bullet"/>
+      <w:lvlText w:val="-"/>
+      <w:lvlJc w:val="left"/>
+      <w:pPr>
+        <w:ind w:left="720" w:hanging="360"/>
+      </w:pPr>
+      <w:rPr>
+        <w:rFonts w:ascii="Aptos" w:eastAsiaTheme="minorHAnsi" w:hAnsi="Aptos" w:cstheme="minorBidi" w:hint="default"/>
+      </w:rPr>
+    </w:lvl>
+    <w:lvl w:ilvl="1" w:tplc="040C0003" w:tentative="1">
+      <w:start w:val="1"/>
+      <w:numFmt w:val="bullet"/>
+      <w:lvlText w:val="o"/>
+      <w:lvlJc w:val="left"/>
+      <w:pPr>
+        <w:ind w:left="1440" w:hanging="360"/>
+      </w:pPr>
+      <w:rPr>
+        <w:rFonts w:ascii="Courier New" w:hAnsi="Courier New" w:cs="Courier New" w:hint="default"/>
+      </w:rPr>
+    </w:lvl>
+    <w:lvl w:ilvl="2" w:tplc="040C0005" w:tentative="1">
+      <w:start w:val="1"/>
+      <w:numFmt w:val="bullet"/>
+      <w:lvlText w:val=""/>
+      <w:lvlJc w:val="left"/>
+      <w:pPr>
+        <w:ind w:left="2160" w:hanging="360"/>
+      </w:pPr>
+      <w:rPr>
+        <w:rFonts w:ascii="Wingdings" w:hAnsi="Wingdings" w:hint="default"/>
+      </w:rPr>
+    </w:lvl>
+    <w:lvl w:ilvl="3" w:tplc="040C0001" w:tentative="1">
+      <w:start w:val="1"/>
+      <w:numFmt w:val="bullet"/>
+      <w:lvlText w:val=""/>
+      <w:lvlJc w:val="left"/>
+      <w:pPr>
+        <w:ind w:left="2880" w:hanging="360"/>
+      </w:pPr>
+      <w:rPr>
+        <w:rFonts w:ascii="Symbol" w:hAnsi="Symbol" w:hint="default"/>
+      </w:rPr>
+    </w:lvl>
+    <w:lvl w:ilvl="4" w:tplc="040C0003" w:tentative="1">
+      <w:start w:val="1"/>
+      <w:numFmt w:val="bullet"/>
+      <w:lvlText w:val="o"/>
+      <w:lvlJc w:val="left"/>
+      <w:pPr>
+        <w:ind w:left="3600" w:hanging="360"/>
+      </w:pPr>
+      <w:rPr>
+        <w:rFonts w:ascii="Courier New" w:hAnsi="Courier New" w:cs="Courier New" w:hint="default"/>
+      </w:rPr>
+    </w:lvl>
+    <w:lvl w:ilvl="5" w:tplc="040C0005" w:tentative="1">
+      <w:start w:val="1"/>
+      <w:numFmt w:val="bullet"/>
+      <w:lvlText w:val=""/>
+      <w:lvlJc w:val="left"/>
+      <w:pPr>
+        <w:ind w:left="4320" w:hanging="360"/>
+      </w:pPr>
+      <w:rPr>
+        <w:rFonts w:ascii="Wingdings" w:hAnsi="Wingdings" w:hint="default"/>
+      </w:rPr>
+    </w:lvl>
+    <w:lvl w:ilvl="6" w:tplc="040C0001" w:tentative="1">
+      <w:start w:val="1"/>
+      <w:numFmt w:val="bullet"/>
+      <w:lvlText w:val=""/>
+      <w:lvlJc w:val="left"/>
+      <w:pPr>
+        <w:ind w:left="5040" w:hanging="360"/>
+      </w:pPr>
+      <w:rPr>
+        <w:rFonts w:ascii="Symbol" w:hAnsi="Symbol" w:hint="default"/>
+      </w:rPr>
+    </w:lvl>
+    <w:lvl w:ilvl="7" w:tplc="040C0003" w:tentative="1">
+      <w:start w:val="1"/>
+      <w:numFmt w:val="bullet"/>
+      <w:lvlText w:val="o"/>
+      <w:lvlJc w:val="left"/>
+      <w:pPr>
+        <w:ind w:left="5760" w:hanging="360"/>
+      </w:pPr>
+      <w:rPr>
+        <w:rFonts w:ascii="Courier New" w:hAnsi="Courier New" w:cs="Courier New" w:hint="default"/>
+      </w:rPr>
+    </w:lvl>
+    <w:lvl w:ilvl="8" w:tplc="040C0005" w:tentative="1">
+      <w:start w:val="1"/>
+      <w:numFmt w:val="bullet"/>
+      <w:lvlText w:val=""/>
+      <w:lvlJc w:val="left"/>
+      <w:pPr>
+        <w:ind w:left="6480" w:hanging="360"/>
+      </w:pPr>
+      <w:rPr>
+        <w:rFonts w:ascii="Wingdings" w:hAnsi="Wingdings" w:hint="default"/>
+      </w:rPr>
+    </w:lvl>
+  </w:abstractNum>
+  <w:num w:numId="1" w16cid:durableId="555746852">
+    <w:abstractNumId w:val="0"/>
+  </w:num>
+</w:numbering>
 </file>
 
 <file path=word/styles.xml><?xml version="1.0" encoding="utf-8"?>
@@ -1848,7 +2760,6 @@
   <w:style w:type="character" w:default="1" w:styleId="Policepardfaut">
     <w:name w:val="Default Paragraph Font"/>
     <w:uiPriority w:val="1"/>
-    <w:semiHidden/>
     <w:unhideWhenUsed/>
   </w:style>
   <w:style w:type="table" w:default="1" w:styleId="TableauNormal">

</xml_diff>

<commit_message>
Ajouts de Patterns de LA & PA maintenables et d'un pattern d'initialisation de modèle M&S au RECP
</commit_message>
<xml_diff>
--- a/recp/PatternsRECPLevelData/PatternsDiagramImages/MockRECP/Nouveau Document Microsoft Word.docx
+++ b/recp/PatternsRECPLevelData/PatternsDiagramImages/MockRECP/Nouveau Document Microsoft Word.docx
@@ -689,21 +689,7 @@
         <w:rPr>
           <w:lang w:val="en-US"/>
         </w:rPr>
-        <w:t xml:space="preserve"> Applying </w:t>
-      </w:r>
-      <w:proofErr w:type="gramStart"/>
-      <w:r>
-        <w:rPr>
-          <w:lang w:val="en-US"/>
-        </w:rPr>
-        <w:t>a</w:t>
-      </w:r>
-      <w:proofErr w:type="gramEnd"/>
-      <w:r>
-        <w:rPr>
-          <w:lang w:val="en-US"/>
-        </w:rPr>
-        <w:t xml:space="preserve"> EARS’ boilerplate adapted to the case of DTS’ Engineering</w:t>
+        <w:t xml:space="preserve"> Applying a EARS’ boilerplate adapted to the case of DTS’ Engineering</w:t>
       </w:r>
     </w:p>
     <w:p>
@@ -1454,21 +1440,7 @@
         <w:rPr>
           <w:lang w:val="en-US"/>
         </w:rPr>
-        <w:t xml:space="preserve"> Agent through a </w:t>
-      </w:r>
-      <w:proofErr w:type="gramStart"/>
-      <w:r>
-        <w:rPr>
-          <w:lang w:val="en-US"/>
-        </w:rPr>
-        <w:t>publish</w:t>
-      </w:r>
-      <w:proofErr w:type="gramEnd"/>
-      <w:r>
-        <w:rPr>
-          <w:lang w:val="en-US"/>
-        </w:rPr>
-        <w:t xml:space="preserve"> action</w:t>
+        <w:t xml:space="preserve"> Agent through a publish action</w:t>
       </w:r>
       <w:r>
         <w:rPr>
@@ -1514,19 +1486,7 @@
         <w:rPr>
           <w:lang w:val="en-US"/>
         </w:rPr>
-        <w:t xml:space="preserve">[From a </w:t>
-      </w:r>
-      <w:r>
-        <w:rPr>
-          <w:lang w:val="en-US"/>
-        </w:rPr>
-        <w:t>logical</w:t>
-      </w:r>
-      <w:r>
-        <w:rPr>
-          <w:lang w:val="en-US"/>
-        </w:rPr>
-        <w:t xml:space="preserve"> architecture view]</w:t>
+        <w:t>[From a logical architecture view]</w:t>
       </w:r>
       <w:r>
         <w:rPr>
@@ -1628,13 +1588,7 @@
         <w:rPr>
           <w:lang w:val="en-US"/>
         </w:rPr>
-        <w:t>motivated by a Federation of tools technique and inspiration</w:t>
-      </w:r>
-      <w:r>
-        <w:rPr>
-          <w:lang w:val="en-US"/>
-        </w:rPr>
-        <w:t xml:space="preserve"> and </w:t>
+        <w:t xml:space="preserve">motivated by a Federation of tools technique and inspiration and </w:t>
       </w:r>
       <w:r>
         <w:rPr>
@@ -1666,21 +1620,7 @@
         <w:rPr>
           <w:lang w:val="en-US"/>
         </w:rPr>
-        <w:t xml:space="preserve">Language, a Block-Definition Diagram of a relevant candidate Logical Architecture inspired by the current Architectural Pattern could be described as </w:t>
-      </w:r>
-      <w:proofErr w:type="gramStart"/>
-      <w:r>
-        <w:rPr>
-          <w:lang w:val="en-US"/>
-        </w:rPr>
-        <w:t>follow</w:t>
-      </w:r>
-      <w:proofErr w:type="gramEnd"/>
-      <w:r>
-        <w:rPr>
-          <w:lang w:val="en-US"/>
-        </w:rPr>
-        <w:t>:</w:t>
+        <w:t>Language, a Block-Definition Diagram of a relevant candidate Logical Architecture inspired by the current Architectural Pattern could be described as follow:</w:t>
       </w:r>
     </w:p>
     <w:p>
@@ -1723,14 +1663,12 @@
         <w:t>IPublisher</w:t>
       </w:r>
       <w:proofErr w:type="spellEnd"/>
-      <w:proofErr w:type="gramStart"/>
       <w:r>
         <w:rPr>
           <w:lang w:val="en-US"/>
         </w:rPr>
         <w:t>”;</w:t>
       </w:r>
-      <w:proofErr w:type="gramEnd"/>
     </w:p>
     <w:p>
       <w:pPr>
@@ -1770,6 +1708,9 @@
     </w:p>
     <w:p>
       <w:pPr>
+        <w:pBdr>
+          <w:bottom w:val="double" w:sz="6" w:space="1" w:color="auto"/>
+        </w:pBdr>
         <w:rPr>
           <w:lang w:val="en-US"/>
         </w:rPr>
@@ -2010,23 +1951,1720 @@
         <w:rPr>
           <w:lang w:val="en-US"/>
         </w:rPr>
-        <w:t xml:space="preserve"> Agent through a </w:t>
-      </w:r>
-      <w:proofErr w:type="gramStart"/>
-      <w:r>
-        <w:rPr>
-          <w:lang w:val="en-US"/>
-        </w:rPr>
-        <w:t>publish</w:t>
-      </w:r>
-      <w:proofErr w:type="gramEnd"/>
-      <w:r>
-        <w:rPr>
-          <w:lang w:val="en-US"/>
-        </w:rPr>
-        <w:t xml:space="preserve"> action using this topic, the broker transmitted the appropriate message to the simulation model. As a response, this latter changed its type of input accordingly.      </w:t>
+        <w:t xml:space="preserve"> Agent through a publish action using this topic, the broker transmitted the appropriate message to the simulation model. As a response, this latter changed its type of input accordingly.      </w:t>
       </w:r>
     </w:p>
+    <w:p>
+      <w:pPr>
+        <w:rPr>
+          <w:b/>
+          <w:bCs/>
+          <w:lang w:val="en-US"/>
+        </w:rPr>
+      </w:pPr>
+      <w:r>
+        <w:rPr>
+          <w:b/>
+          <w:bCs/>
+          <w:lang w:val="en-US"/>
+        </w:rPr>
+        <w:t>DTS'</w:t>
+      </w:r>
+      <w:r>
+        <w:rPr>
+          <w:b/>
+          <w:bCs/>
+          <w:lang w:val="en-US"/>
+        </w:rPr>
+        <w:t xml:space="preserve"> </w:t>
+      </w:r>
+      <w:r>
+        <w:rPr>
+          <w:b/>
+          <w:bCs/>
+          <w:lang w:val="en-US"/>
+        </w:rPr>
+        <w:t>logical</w:t>
+      </w:r>
+      <w:r>
+        <w:rPr>
+          <w:b/>
+          <w:bCs/>
+          <w:lang w:val="en-US"/>
+        </w:rPr>
+        <w:t>/physical</w:t>
+      </w:r>
+      <w:r>
+        <w:rPr>
+          <w:b/>
+          <w:bCs/>
+          <w:lang w:val="en-US"/>
+        </w:rPr>
+        <w:t xml:space="preserve"> architecture pattern respecting the principles of </w:t>
+      </w:r>
+      <w:r>
+        <w:rPr>
+          <w:b/>
+          <w:bCs/>
+          <w:lang w:val="en-US"/>
+        </w:rPr>
+        <w:t xml:space="preserve"> </w:t>
+      </w:r>
+      <w:r>
+        <w:rPr>
+          <w:b/>
+          <w:bCs/>
+          <w:lang w:val="en-US"/>
+        </w:rPr>
+        <w:t>: O (Open/Close) of SOLID, Sep</w:t>
+      </w:r>
+      <w:r>
+        <w:rPr>
+          <w:b/>
+          <w:bCs/>
+          <w:lang w:val="en-US"/>
+        </w:rPr>
+        <w:t>a</w:t>
+      </w:r>
+      <w:r>
+        <w:rPr>
+          <w:b/>
+          <w:bCs/>
+          <w:lang w:val="en-US"/>
+        </w:rPr>
+        <w:t>ration of Concerns, Loose-Coupling and is inspired by a STRATEGY design pattern</w:t>
+      </w:r>
+    </w:p>
+    <w:p>
+      <w:pPr>
+        <w:rPr>
+          <w:lang w:val="en-US"/>
+        </w:rPr>
+      </w:pPr>
+      <w:r>
+        <w:rPr>
+          <w:b/>
+          <w:bCs/>
+          <w:lang w:val="en-US"/>
+        </w:rPr>
+        <w:t>Problem </w:t>
+      </w:r>
+      <w:r>
+        <w:rPr>
+          <w:b/>
+          <w:bCs/>
+          <w:lang w:val="en-US"/>
+        </w:rPr>
+        <w:t>Statement</w:t>
+      </w:r>
+      <w:r>
+        <w:rPr>
+          <w:b/>
+          <w:bCs/>
+          <w:lang w:val="en-US"/>
+        </w:rPr>
+        <w:t xml:space="preserve">: </w:t>
+      </w:r>
+      <w:r>
+        <w:rPr>
+          <w:lang w:val="en-US"/>
+        </w:rPr>
+        <w:t xml:space="preserve">Designing a highly maintainable logical architecture of a DTS </w:t>
+      </w:r>
+    </w:p>
+    <w:p>
+      <w:pPr>
+        <w:rPr>
+          <w:lang w:val="en-US"/>
+        </w:rPr>
+      </w:pPr>
+      <w:r>
+        <w:rPr>
+          <w:b/>
+          <w:bCs/>
+          <w:lang w:val="en-US"/>
+        </w:rPr>
+        <w:t>Solution</w:t>
+      </w:r>
+      <w:r>
+        <w:rPr>
+          <w:b/>
+          <w:bCs/>
+          <w:lang w:val="en-US"/>
+        </w:rPr>
+        <w:t xml:space="preserve"> Statement</w:t>
+      </w:r>
+      <w:r>
+        <w:rPr>
+          <w:b/>
+          <w:bCs/>
+          <w:lang w:val="en-US"/>
+        </w:rPr>
+        <w:t>:</w:t>
+      </w:r>
+      <w:r>
+        <w:rPr>
+          <w:lang w:val="en-US"/>
+        </w:rPr>
+        <w:t xml:space="preserve"> Applying a DTS-specific architectural pattern for logical </w:t>
+      </w:r>
+      <w:r>
+        <w:rPr>
+          <w:lang w:val="en-US"/>
+        </w:rPr>
+        <w:t xml:space="preserve">and/or </w:t>
+      </w:r>
+      <w:r>
+        <w:rPr>
+          <w:lang w:val="en-US"/>
+        </w:rPr>
+        <w:t>architecture design which does respects</w:t>
+      </w:r>
+      <w:r>
+        <w:rPr>
+          <w:lang w:val="en-US"/>
+        </w:rPr>
+        <w:t xml:space="preserve"> the principles of: O (Open/Close) of SOLID, Separation of Concerns, Loose-Coupling and is inspired by a STRATEGY design pattern</w:t>
+      </w:r>
+      <w:r>
+        <w:rPr>
+          <w:lang w:val="en-US"/>
+        </w:rPr>
+        <w:t>.</w:t>
+      </w:r>
+    </w:p>
+    <w:p>
+      <w:pPr>
+        <w:rPr>
+          <w:lang w:val="en-US"/>
+        </w:rPr>
+      </w:pPr>
+      <w:r>
+        <w:rPr>
+          <w:b/>
+          <w:bCs/>
+          <w:lang w:val="en-US"/>
+        </w:rPr>
+        <w:t>Situation from which the pattern was deduced</w:t>
+      </w:r>
+      <w:r>
+        <w:rPr>
+          <w:b/>
+          <w:bCs/>
+          <w:lang w:val="en-US"/>
+        </w:rPr>
+        <w:t>:</w:t>
+      </w:r>
+      <w:r>
+        <w:rPr>
+          <w:lang w:val="en-US"/>
+        </w:rPr>
+        <w:t xml:space="preserve"> The pattern was deduced from a very simple workshop’s DTS engineering project. More concretely, it was needed to make it possible to command the type of resource received as an input of a Workshop Source of simulation model under </w:t>
+      </w:r>
+      <w:proofErr w:type="spellStart"/>
+      <w:r>
+        <w:rPr>
+          <w:lang w:val="en-US"/>
+        </w:rPr>
+        <w:t>Tecnomatix</w:t>
+      </w:r>
+      <w:proofErr w:type="spellEnd"/>
+      <w:r>
+        <w:rPr>
+          <w:lang w:val="en-US"/>
+        </w:rPr>
+        <w:t xml:space="preserve"> </w:t>
+      </w:r>
+      <w:proofErr w:type="spellStart"/>
+      <w:r>
+        <w:rPr>
+          <w:lang w:val="en-US"/>
+        </w:rPr>
+        <w:t>PlantSimulation</w:t>
+      </w:r>
+      <w:proofErr w:type="spellEnd"/>
+      <w:r>
+        <w:rPr>
+          <w:lang w:val="en-US"/>
+        </w:rPr>
+        <w:t xml:space="preserve"> from an external </w:t>
+      </w:r>
+      <w:proofErr w:type="spellStart"/>
+      <w:r>
+        <w:rPr>
+          <w:lang w:val="en-US"/>
+        </w:rPr>
+        <w:t>Ingescape</w:t>
+      </w:r>
+      <w:proofErr w:type="spellEnd"/>
+      <w:r>
+        <w:rPr>
+          <w:lang w:val="en-US"/>
+        </w:rPr>
+        <w:t xml:space="preserve"> Agent. To do so, a </w:t>
+      </w:r>
+      <w:proofErr w:type="spellStart"/>
+      <w:r>
+        <w:rPr>
+          <w:lang w:val="en-US"/>
+        </w:rPr>
+        <w:t>HiveMq</w:t>
+      </w:r>
+      <w:proofErr w:type="spellEnd"/>
+      <w:r>
+        <w:rPr>
+          <w:lang w:val="en-US"/>
+        </w:rPr>
+        <w:t xml:space="preserve"> MQTT Broker was first encapsulated as an </w:t>
+      </w:r>
+      <w:proofErr w:type="spellStart"/>
+      <w:r>
+        <w:rPr>
+          <w:lang w:val="en-US"/>
+        </w:rPr>
+        <w:t>Ingescape</w:t>
+      </w:r>
+      <w:proofErr w:type="spellEnd"/>
+      <w:r>
+        <w:rPr>
+          <w:lang w:val="en-US"/>
+        </w:rPr>
+        <w:t xml:space="preserve"> Agent. Then, a topic dedicated to this type of input was added within this broker agent and both the </w:t>
+      </w:r>
+      <w:proofErr w:type="spellStart"/>
+      <w:r>
+        <w:rPr>
+          <w:lang w:val="en-US"/>
+        </w:rPr>
+        <w:t>Ingescape</w:t>
+      </w:r>
+      <w:proofErr w:type="spellEnd"/>
+      <w:r>
+        <w:rPr>
+          <w:lang w:val="en-US"/>
+        </w:rPr>
+        <w:t xml:space="preserve"> agent and simulation model had to subscribe to this topic. Once a type of </w:t>
+      </w:r>
+      <w:r>
+        <w:rPr>
+          <w:lang w:val="en-US"/>
+        </w:rPr>
+        <w:lastRenderedPageBreak/>
+        <w:t xml:space="preserve">input was specified by the </w:t>
+      </w:r>
+      <w:proofErr w:type="spellStart"/>
+      <w:r>
+        <w:rPr>
+          <w:lang w:val="en-US"/>
+        </w:rPr>
+        <w:t>Ingescape</w:t>
+      </w:r>
+      <w:proofErr w:type="spellEnd"/>
+      <w:r>
+        <w:rPr>
+          <w:lang w:val="en-US"/>
+        </w:rPr>
+        <w:t xml:space="preserve"> Agent through a publish action using this topic, the broker transmitted the appropriate message to the simulation model. As a response, this latter changed its type of input accordingly.      </w:t>
+      </w:r>
+    </w:p>
+    <w:p>
+      <w:pPr>
+        <w:rPr>
+          <w:lang w:val="en-US"/>
+        </w:rPr>
+      </w:pPr>
+    </w:p>
+    <w:p>
+      <w:pPr>
+        <w:jc w:val="both"/>
+        <w:rPr>
+          <w:lang w:val="en-US"/>
+        </w:rPr>
+      </w:pPr>
+      <w:r>
+        <w:rPr>
+          <w:b/>
+          <w:bCs/>
+          <w:lang w:val="en-US"/>
+        </w:rPr>
+        <w:t>Example Of Application Statements 1:</w:t>
+      </w:r>
+      <w:r>
+        <w:rPr>
+          <w:lang w:val="en-US"/>
+        </w:rPr>
+        <w:t xml:space="preserve"> </w:t>
+      </w:r>
+      <w:r>
+        <w:rPr>
+          <w:lang w:val="en-US"/>
+        </w:rPr>
+        <w:t>[From a logical architecture view]</w:t>
+      </w:r>
+      <w:r>
+        <w:rPr>
+          <w:lang w:val="en-US"/>
+        </w:rPr>
+        <w:t xml:space="preserve"> </w:t>
+      </w:r>
+      <w:r>
+        <w:rPr>
+          <w:lang w:val="en-US"/>
+        </w:rPr>
+        <w:t xml:space="preserve">The DTS of interest was that of a dairy product workshop. </w:t>
+      </w:r>
+      <w:r>
+        <w:rPr>
+          <w:lang w:val="en-US"/>
+        </w:rPr>
+        <w:t xml:space="preserve">As its main </w:t>
+      </w:r>
+      <w:r>
+        <w:rPr>
+          <w:lang w:val="en-US"/>
+        </w:rPr>
+        <w:t>mission</w:t>
+      </w:r>
+      <w:r>
+        <w:rPr>
+          <w:lang w:val="en-US"/>
+        </w:rPr>
+        <w:t>, this DTS has to help and assist the workshop’s scheduler in his tasks related to the resources’ allocations.</w:t>
+      </w:r>
+      <w:r>
+        <w:rPr>
+          <w:lang w:val="en-US"/>
+        </w:rPr>
+        <w:t xml:space="preserve"> To do so, the Digital Twin entity (DT) of the DTS has to </w:t>
+      </w:r>
+      <w:r>
+        <w:rPr>
+          <w:lang w:val="en-US"/>
+        </w:rPr>
+        <w:t>possess</w:t>
+      </w:r>
+      <w:r>
+        <w:rPr>
+          <w:lang w:val="en-US"/>
+        </w:rPr>
+        <w:t xml:space="preserve"> an AI-based optimizer in charge of the necessary intelligent calculations of optimized sequences </w:t>
+      </w:r>
+      <w:r>
+        <w:rPr>
+          <w:lang w:val="en-US"/>
+        </w:rPr>
+        <w:t>of resources</w:t>
+      </w:r>
+      <w:r>
+        <w:rPr>
+          <w:lang w:val="en-US"/>
+        </w:rPr>
+        <w:t xml:space="preserve">’ allocations. The requirements related to this optimizer </w:t>
+      </w:r>
+      <w:r>
+        <w:rPr>
+          <w:lang w:val="en-US"/>
+        </w:rPr>
+        <w:t>are</w:t>
+      </w:r>
+      <w:r>
+        <w:rPr>
+          <w:lang w:val="en-US"/>
+        </w:rPr>
+        <w:t xml:space="preserve"> frequently evolving</w:t>
+      </w:r>
+      <w:r>
+        <w:rPr>
+          <w:lang w:val="en-US"/>
+        </w:rPr>
+        <w:t>,</w:t>
+      </w:r>
+      <w:r>
+        <w:rPr>
+          <w:lang w:val="en-US"/>
+        </w:rPr>
+        <w:t xml:space="preserve"> so this latter </w:t>
+      </w:r>
+      <w:r>
+        <w:rPr>
+          <w:lang w:val="en-US"/>
+        </w:rPr>
+        <w:t>must</w:t>
+      </w:r>
+      <w:r>
+        <w:rPr>
+          <w:lang w:val="en-US"/>
+        </w:rPr>
+        <w:t xml:space="preserve"> adapt continuously. </w:t>
+      </w:r>
+      <w:r>
+        <w:rPr>
+          <w:lang w:val="en-US"/>
+        </w:rPr>
+        <w:t xml:space="preserve">Therefore, a corresponding logical architecture, at the level of the DT &amp; its sub-systems (AI-models), should respect and non-violate the principles  of </w:t>
+      </w:r>
+      <w:r>
+        <w:rPr>
+          <w:lang w:val="en-US"/>
+        </w:rPr>
+        <w:t>O (Open/Close) of SOLID, Separation of Concerns</w:t>
+      </w:r>
+      <w:r>
+        <w:rPr>
+          <w:lang w:val="en-US"/>
+        </w:rPr>
+        <w:t xml:space="preserve"> and that</w:t>
+      </w:r>
+      <w:r>
+        <w:rPr>
+          <w:lang w:val="en-US"/>
+        </w:rPr>
+        <w:t xml:space="preserve"> </w:t>
+      </w:r>
+      <w:r>
+        <w:rPr>
+          <w:lang w:val="en-US"/>
+        </w:rPr>
+        <w:t xml:space="preserve">of the </w:t>
+      </w:r>
+      <w:r>
+        <w:rPr>
+          <w:lang w:val="en-US"/>
+        </w:rPr>
+        <w:t>Loose-Coupling</w:t>
+      </w:r>
+      <w:r>
+        <w:rPr>
+          <w:lang w:val="en-US"/>
+        </w:rPr>
+        <w:t xml:space="preserve"> </w:t>
+      </w:r>
+      <w:r>
+        <w:rPr>
+          <w:lang w:val="en-US"/>
+        </w:rPr>
+        <w:t xml:space="preserve">by always involving </w:t>
+      </w:r>
+      <w:r>
+        <w:rPr>
+          <w:lang w:val="en-US"/>
+        </w:rPr>
+        <w:t xml:space="preserve">appropriate </w:t>
+      </w:r>
+      <w:r>
+        <w:rPr>
+          <w:lang w:val="en-US"/>
+        </w:rPr>
+        <w:t>interface class</w:t>
+      </w:r>
+      <w:r>
+        <w:rPr>
+          <w:lang w:val="en-US"/>
+        </w:rPr>
+        <w:t>es</w:t>
+      </w:r>
+      <w:r>
+        <w:rPr>
+          <w:lang w:val="en-US"/>
+        </w:rPr>
+        <w:t xml:space="preserve"> when it comes to </w:t>
+      </w:r>
+      <w:r>
+        <w:rPr>
+          <w:lang w:val="en-US"/>
+        </w:rPr>
+        <w:t xml:space="preserve">explicit a lower level of elements (sub-systems, e.g. Virtual models, simulation models, AI models…) and each of those elements must implements </w:t>
+      </w:r>
+      <w:r>
+        <w:rPr>
+          <w:lang w:val="en-US"/>
+        </w:rPr>
+        <w:t>a relevant</w:t>
+      </w:r>
+      <w:r>
+        <w:rPr>
+          <w:lang w:val="en-US"/>
+        </w:rPr>
+        <w:t xml:space="preserve"> interface accordingly.</w:t>
+      </w:r>
+      <w:r>
+        <w:rPr>
+          <w:lang w:val="en-US"/>
+        </w:rPr>
+        <w:t xml:space="preserve"> By doing so, when the moment of changing the current logical description of a virtual model (AI model for our case) will come, a relevant STRATEGY design pattern application is by default enabled and will make it easier to switch from one model to another which is closer to the recent requirement in terms of logical architecture. </w:t>
+      </w:r>
+      <w:r>
+        <w:rPr>
+          <w:lang w:val="en-US"/>
+        </w:rPr>
+        <w:t>This “switch” action is done by indicating the new target of the derived association “</w:t>
+      </w:r>
+      <w:r>
+        <w:rPr>
+          <w:lang w:val="en-US"/>
+        </w:rPr>
+        <w:t>/</w:t>
+      </w:r>
+      <w:proofErr w:type="spellStart"/>
+      <w:r>
+        <w:rPr>
+          <w:lang w:val="en-US"/>
+        </w:rPr>
+        <w:t>currentPDPOptimizer</w:t>
+      </w:r>
+      <w:proofErr w:type="spellEnd"/>
+      <w:r>
+        <w:rPr>
+          <w:lang w:val="en-US"/>
+        </w:rPr>
+        <w:t>”</w:t>
+      </w:r>
+      <w:r>
+        <w:rPr>
+          <w:lang w:val="en-US"/>
+        </w:rPr>
+        <w:t xml:space="preserve"> (derived from the main composition link between the DT and any Virtual Model of it)</w:t>
+      </w:r>
+      <w:r>
+        <w:rPr>
+          <w:lang w:val="en-US"/>
+        </w:rPr>
+        <w:t xml:space="preserve">, </w:t>
+      </w:r>
+      <w:r>
+        <w:rPr>
+          <w:lang w:val="en-US"/>
+        </w:rPr>
+        <w:t xml:space="preserve"> </w:t>
+      </w:r>
+      <w:r>
+        <w:rPr>
+          <w:lang w:val="en-US"/>
+        </w:rPr>
+        <w:t>which will be the new AI model to be taken into account.</w:t>
+      </w:r>
+    </w:p>
+    <w:p>
+      <w:pPr>
+        <w:jc w:val="both"/>
+        <w:rPr>
+          <w:lang w:val="en-US"/>
+        </w:rPr>
+      </w:pPr>
+      <w:r>
+        <w:rPr>
+          <w:b/>
+          <w:bCs/>
+          <w:lang w:val="en-US"/>
+        </w:rPr>
+        <w:t>Example Of Application Statements 1:</w:t>
+      </w:r>
+      <w:r>
+        <w:rPr>
+          <w:lang w:val="en-US"/>
+        </w:rPr>
+        <w:t xml:space="preserve"> </w:t>
+      </w:r>
+      <w:r>
+        <w:rPr>
+          <w:lang w:val="en-US"/>
+        </w:rPr>
+        <w:t>[From a logical architecture view]</w:t>
+      </w:r>
+      <w:r>
+        <w:rPr>
+          <w:lang w:val="en-US"/>
+        </w:rPr>
+        <w:t xml:space="preserve"> </w:t>
+      </w:r>
+      <w:r>
+        <w:rPr>
+          <w:lang w:val="en-US"/>
+        </w:rPr>
+        <w:t xml:space="preserve">The DTS of interest was that of a dairy product workshop. As its main mission, this DTS has to help and assist the workshop’s scheduler in his tasks related to the resources’ allocations. To do so, the Digital Twin entity (DT) of the DTS has to possess an AI-based optimizer in charge of the necessary intelligent calculations of optimized sequences of resources’ allocations. </w:t>
+      </w:r>
+      <w:r>
+        <w:rPr>
+          <w:lang w:val="en-US"/>
+        </w:rPr>
+        <w:t>Three different AI-based algorithm</w:t>
+      </w:r>
+      <w:r>
+        <w:rPr>
+          <w:lang w:val="en-US"/>
+        </w:rPr>
+        <w:t>s</w:t>
+      </w:r>
+      <w:r>
+        <w:rPr>
+          <w:lang w:val="en-US"/>
+        </w:rPr>
+        <w:t xml:space="preserve"> were considered but t</w:t>
+      </w:r>
+      <w:r>
+        <w:rPr>
+          <w:lang w:val="en-US"/>
+        </w:rPr>
+        <w:t>he requirements related to this optimizer are frequently evolving</w:t>
+      </w:r>
+      <w:r>
+        <w:rPr>
+          <w:lang w:val="en-US"/>
+        </w:rPr>
+        <w:t>.</w:t>
+      </w:r>
+      <w:r>
+        <w:rPr>
+          <w:lang w:val="en-US"/>
+        </w:rPr>
+        <w:t xml:space="preserve"> </w:t>
+      </w:r>
+      <w:r>
+        <w:rPr>
+          <w:lang w:val="en-US"/>
+        </w:rPr>
+        <w:t>C</w:t>
+      </w:r>
+      <w:r>
+        <w:rPr>
+          <w:lang w:val="en-US"/>
+        </w:rPr>
+        <w:t>ontinuous adaptation is</w:t>
+      </w:r>
+      <w:r>
+        <w:rPr>
+          <w:lang w:val="en-US"/>
+        </w:rPr>
+        <w:t xml:space="preserve"> therefore</w:t>
+      </w:r>
+      <w:r>
+        <w:rPr>
+          <w:lang w:val="en-US"/>
+        </w:rPr>
+        <w:t xml:space="preserve"> always required</w:t>
+      </w:r>
+      <w:r>
+        <w:rPr>
+          <w:lang w:val="en-US"/>
+        </w:rPr>
+        <w:t>. T</w:t>
+      </w:r>
+      <w:r>
+        <w:rPr>
+          <w:lang w:val="en-US"/>
+        </w:rPr>
+        <w:t>o do so</w:t>
+      </w:r>
+      <w:r>
+        <w:rPr>
+          <w:lang w:val="en-US"/>
+        </w:rPr>
+        <w:t xml:space="preserve">, a corresponding logical architecture, at the level of the DT &amp; its sub-systems (AI-models), should respect and non-violate the principles  of </w:t>
+      </w:r>
+      <w:r>
+        <w:rPr>
+          <w:lang w:val="en-US"/>
+        </w:rPr>
+        <w:t>O (Open/Close) of SOLID, Separation of Concerns</w:t>
+      </w:r>
+      <w:r>
+        <w:rPr>
+          <w:lang w:val="en-US"/>
+        </w:rPr>
+        <w:t xml:space="preserve"> and that</w:t>
+      </w:r>
+      <w:r>
+        <w:rPr>
+          <w:lang w:val="en-US"/>
+        </w:rPr>
+        <w:t xml:space="preserve"> </w:t>
+      </w:r>
+      <w:r>
+        <w:rPr>
+          <w:lang w:val="en-US"/>
+        </w:rPr>
+        <w:t xml:space="preserve">of the </w:t>
+      </w:r>
+      <w:r>
+        <w:rPr>
+          <w:lang w:val="en-US"/>
+        </w:rPr>
+        <w:t>Loose-Coupling</w:t>
+      </w:r>
+      <w:r>
+        <w:rPr>
+          <w:lang w:val="en-US"/>
+        </w:rPr>
+        <w:t xml:space="preserve"> by always involving appropriate interface classes when it comes to explicit a lower level of elements (sub-systems, e.g. Virtual models, simulation models, AI models…) and each of those elements must implements a relevant interface accordingly. By doing so, when the moment of changing the current logical description of a virtual model (AI model for our case) will come, a relevant STRATEGY design pattern application is by default enabled and will make it easier to switch from one model to another which is closer to the recent </w:t>
+      </w:r>
+      <w:r>
+        <w:rPr>
+          <w:lang w:val="en-US"/>
+        </w:rPr>
+        <w:lastRenderedPageBreak/>
+        <w:t>requirement in terms of logical architecture. This “switch” action is done by indicating the new target of the derived association “/</w:t>
+      </w:r>
+      <w:proofErr w:type="spellStart"/>
+      <w:r>
+        <w:rPr>
+          <w:lang w:val="en-US"/>
+        </w:rPr>
+        <w:t>currentPDPOptimizer</w:t>
+      </w:r>
+      <w:proofErr w:type="spellEnd"/>
+      <w:r>
+        <w:rPr>
+          <w:lang w:val="en-US"/>
+        </w:rPr>
+        <w:t>” (derived from the main composition link between the DT and any Virtual Model of it), which will be the new AI model to be taken into account.</w:t>
+      </w:r>
+    </w:p>
+    <w:p>
+      <w:pPr>
+        <w:jc w:val="both"/>
+        <w:rPr>
+          <w:lang w:val="en-US"/>
+        </w:rPr>
+      </w:pPr>
+      <w:r>
+        <w:rPr>
+          <w:b/>
+          <w:bCs/>
+          <w:lang w:val="en-US"/>
+        </w:rPr>
+        <w:t xml:space="preserve">Example Of Application Statements </w:t>
+      </w:r>
+      <w:r>
+        <w:rPr>
+          <w:b/>
+          <w:bCs/>
+          <w:lang w:val="en-US"/>
+        </w:rPr>
+        <w:t>2</w:t>
+      </w:r>
+      <w:r>
+        <w:rPr>
+          <w:b/>
+          <w:bCs/>
+          <w:lang w:val="en-US"/>
+        </w:rPr>
+        <w:t>:</w:t>
+      </w:r>
+      <w:r>
+        <w:rPr>
+          <w:lang w:val="en-US"/>
+        </w:rPr>
+        <w:t xml:space="preserve"> </w:t>
+      </w:r>
+      <w:r>
+        <w:rPr>
+          <w:lang w:val="en-US"/>
+        </w:rPr>
+        <w:t>[From a physical architecture view]</w:t>
+      </w:r>
+      <w:r>
+        <w:rPr>
+          <w:lang w:val="en-US"/>
+        </w:rPr>
+        <w:t xml:space="preserve"> </w:t>
+      </w:r>
+      <w:r>
+        <w:rPr>
+          <w:lang w:val="en-US"/>
+        </w:rPr>
+        <w:t xml:space="preserve">The DTS of interest was that of a </w:t>
+      </w:r>
+      <w:r>
+        <w:rPr>
+          <w:lang w:val="en-US"/>
+        </w:rPr>
+        <w:t>simple workshop, from its energy consumption viewpoint</w:t>
+      </w:r>
+      <w:r>
+        <w:rPr>
+          <w:lang w:val="en-US"/>
+        </w:rPr>
+        <w:t xml:space="preserve">. As its main mission, this DTS has to help and assist the workshop’s </w:t>
+      </w:r>
+      <w:r>
+        <w:rPr>
+          <w:lang w:val="en-US"/>
+        </w:rPr>
+        <w:t>manager</w:t>
+      </w:r>
+      <w:r>
+        <w:rPr>
+          <w:lang w:val="en-US"/>
+        </w:rPr>
+        <w:t xml:space="preserve"> in his tasks related to </w:t>
+      </w:r>
+      <w:r>
+        <w:rPr>
+          <w:lang w:val="en-US"/>
+        </w:rPr>
+        <w:t>the energy consumption control</w:t>
+      </w:r>
+      <w:r>
+        <w:rPr>
+          <w:lang w:val="en-US"/>
+        </w:rPr>
+        <w:t xml:space="preserve">. To do so, the Digital Twin entity (DT) of the DTS has to </w:t>
+      </w:r>
+      <w:r>
+        <w:rPr>
+          <w:lang w:val="en-US"/>
+        </w:rPr>
+        <w:t xml:space="preserve">propose and </w:t>
+      </w:r>
+      <w:proofErr w:type="spellStart"/>
+      <w:r>
+        <w:rPr>
+          <w:lang w:val="en-US"/>
+        </w:rPr>
+        <w:t>posses</w:t>
+      </w:r>
+      <w:proofErr w:type="spellEnd"/>
+      <w:r>
+        <w:rPr>
+          <w:lang w:val="en-US"/>
+        </w:rPr>
+        <w:t xml:space="preserve"> a simulation model imitating the real-word behaviors of this workshop</w:t>
+      </w:r>
+      <w:r>
+        <w:rPr>
+          <w:lang w:val="en-US"/>
+        </w:rPr>
+        <w:t>.</w:t>
+      </w:r>
+      <w:r>
+        <w:rPr>
+          <w:lang w:val="en-US"/>
+        </w:rPr>
+        <w:t xml:space="preserve"> A first simulation model was developed under the Arena Software and Visual Basic programming language. But with the arrival of newer requirements, a migration to a </w:t>
+      </w:r>
+      <w:proofErr w:type="spellStart"/>
+      <w:r>
+        <w:rPr>
+          <w:lang w:val="en-US"/>
+        </w:rPr>
+        <w:t>PlantSimulation</w:t>
+      </w:r>
+      <w:proofErr w:type="spellEnd"/>
+      <w:r>
+        <w:rPr>
+          <w:lang w:val="en-US"/>
+        </w:rPr>
+        <w:t xml:space="preserve"> &amp; </w:t>
+      </w:r>
+      <w:proofErr w:type="spellStart"/>
+      <w:r>
+        <w:rPr>
+          <w:lang w:val="en-US"/>
+        </w:rPr>
+        <w:t>Simtalk</w:t>
+      </w:r>
+      <w:proofErr w:type="spellEnd"/>
+      <w:r>
+        <w:rPr>
+          <w:lang w:val="en-US"/>
+        </w:rPr>
+        <w:t xml:space="preserve">-based environment was requested. To make this possible, a physical architecture </w:t>
+      </w:r>
+      <w:r>
+        <w:rPr>
+          <w:lang w:val="en-US"/>
+        </w:rPr>
+        <w:t>respect</w:t>
+      </w:r>
+      <w:r>
+        <w:rPr>
+          <w:lang w:val="en-US"/>
+        </w:rPr>
+        <w:t>ing</w:t>
+      </w:r>
+      <w:r>
+        <w:rPr>
+          <w:lang w:val="en-US"/>
+        </w:rPr>
+        <w:t xml:space="preserve"> and non-violat</w:t>
+      </w:r>
+      <w:r>
+        <w:rPr>
+          <w:lang w:val="en-US"/>
+        </w:rPr>
+        <w:t>ing</w:t>
+      </w:r>
+      <w:r>
+        <w:rPr>
+          <w:lang w:val="en-US"/>
+        </w:rPr>
+        <w:t xml:space="preserve"> the principles  of O (Open/Close) of SOLID, Separation of Concerns and that of the Loose-Coupling</w:t>
+      </w:r>
+      <w:r>
+        <w:rPr>
+          <w:lang w:val="en-US"/>
+        </w:rPr>
+        <w:t xml:space="preserve"> was designed and proposed.</w:t>
+      </w:r>
+      <w:r>
+        <w:rPr>
+          <w:lang w:val="en-US"/>
+        </w:rPr>
+        <w:t xml:space="preserve"> </w:t>
+      </w:r>
+      <w:r>
+        <w:rPr>
+          <w:lang w:val="en-US"/>
+        </w:rPr>
+        <w:t xml:space="preserve">Between the DT’s level and that of the simulations, an </w:t>
+      </w:r>
+      <w:r>
+        <w:rPr>
+          <w:lang w:val="en-US"/>
+        </w:rPr>
+        <w:t>appropriate interface class</w:t>
+      </w:r>
+      <w:r>
+        <w:rPr>
+          <w:lang w:val="en-US"/>
+        </w:rPr>
+        <w:t xml:space="preserve"> was established and</w:t>
+      </w:r>
+      <w:r>
+        <w:rPr>
+          <w:lang w:val="en-US"/>
+        </w:rPr>
+        <w:t xml:space="preserve"> </w:t>
+      </w:r>
+      <w:r>
+        <w:rPr>
+          <w:lang w:val="en-US"/>
+        </w:rPr>
+        <w:t xml:space="preserve">any simulation model under any physical </w:t>
+      </w:r>
+      <w:r>
+        <w:rPr>
+          <w:lang w:val="en-US"/>
+        </w:rPr>
+        <w:t>environment</w:t>
+      </w:r>
+      <w:r>
+        <w:rPr>
+          <w:lang w:val="en-US"/>
+        </w:rPr>
+        <w:t xml:space="preserve"> must implements </w:t>
+      </w:r>
+      <w:r>
+        <w:rPr>
+          <w:lang w:val="en-US"/>
+        </w:rPr>
+        <w:t>it.</w:t>
+      </w:r>
+      <w:r>
+        <w:rPr>
+          <w:lang w:val="en-US"/>
+        </w:rPr>
+        <w:t xml:space="preserve"> By doing so, when the moment of changing the current </w:t>
+      </w:r>
+      <w:r>
+        <w:rPr>
+          <w:lang w:val="en-US"/>
+        </w:rPr>
+        <w:t>simulation model instance</w:t>
+      </w:r>
+      <w:r>
+        <w:rPr>
+          <w:lang w:val="en-US"/>
+        </w:rPr>
+        <w:t xml:space="preserve"> will come</w:t>
+      </w:r>
+      <w:r>
+        <w:rPr>
+          <w:lang w:val="en-US"/>
+        </w:rPr>
+        <w:t xml:space="preserve"> in the future</w:t>
+      </w:r>
+      <w:r>
+        <w:rPr>
+          <w:lang w:val="en-US"/>
+        </w:rPr>
+        <w:t>, a relevant STRATEGY design pattern application is by default enabled and will make it easier to switch from one model to another</w:t>
+      </w:r>
+      <w:r>
+        <w:rPr>
+          <w:lang w:val="en-US"/>
+        </w:rPr>
+        <w:t xml:space="preserve"> (from Arena Software &amp; Visual Basic to </w:t>
+      </w:r>
+      <w:proofErr w:type="spellStart"/>
+      <w:r>
+        <w:rPr>
+          <w:lang w:val="en-US"/>
+        </w:rPr>
+        <w:t>PlantSimulation</w:t>
+      </w:r>
+      <w:proofErr w:type="spellEnd"/>
+      <w:r>
+        <w:rPr>
+          <w:lang w:val="en-US"/>
+        </w:rPr>
+        <w:t xml:space="preserve"> &amp; </w:t>
+      </w:r>
+      <w:proofErr w:type="spellStart"/>
+      <w:r>
+        <w:rPr>
+          <w:lang w:val="en-US"/>
+        </w:rPr>
+        <w:t>Simtalk</w:t>
+      </w:r>
+      <w:proofErr w:type="spellEnd"/>
+      <w:r>
+        <w:rPr>
+          <w:lang w:val="en-US"/>
+        </w:rPr>
+        <w:t>. This “switch” action is done by indicating the new target of the derived association “/</w:t>
+      </w:r>
+      <w:proofErr w:type="spellStart"/>
+      <w:r>
+        <w:rPr>
+          <w:lang w:val="en-US"/>
+        </w:rPr>
+        <w:t>current</w:t>
+      </w:r>
+      <w:r>
+        <w:rPr>
+          <w:lang w:val="en-US"/>
+        </w:rPr>
+        <w:t>SimulationModel</w:t>
+      </w:r>
+      <w:proofErr w:type="spellEnd"/>
+      <w:r>
+        <w:rPr>
+          <w:lang w:val="en-US"/>
+        </w:rPr>
+        <w:t xml:space="preserve">” (derived from the main composition link between the DT and any Virtual Model of it), which will be the new  </w:t>
+      </w:r>
+      <w:r>
+        <w:rPr>
+          <w:lang w:val="en-US"/>
+        </w:rPr>
+        <w:t xml:space="preserve">simulation </w:t>
+      </w:r>
+      <w:r>
+        <w:rPr>
+          <w:lang w:val="en-US"/>
+        </w:rPr>
+        <w:t>model to be taken into account.</w:t>
+      </w:r>
+    </w:p>
+    <w:p>
+      <w:pPr>
+        <w:jc w:val="both"/>
+        <w:rPr>
+          <w:lang w:val="en-US"/>
+        </w:rPr>
+      </w:pPr>
+    </w:p>
+    <w:p>
+      <w:pPr>
+        <w:jc w:val="both"/>
+        <w:rPr>
+          <w:lang w:val="en-US"/>
+        </w:rPr>
+      </w:pPr>
+    </w:p>
+    <w:p>
+      <w:pPr>
+        <w:pBdr>
+          <w:bottom w:val="double" w:sz="6" w:space="1" w:color="auto"/>
+        </w:pBdr>
+        <w:rPr>
+          <w:lang w:val="en-US"/>
+        </w:rPr>
+      </w:pPr>
+    </w:p>
+    <w:p>
+      <w:pPr>
+        <w:jc w:val="both"/>
+        <w:rPr>
+          <w:b/>
+          <w:bCs/>
+        </w:rPr>
+      </w:pPr>
+      <w:r>
+        <w:rPr>
+          <w:b/>
+          <w:bCs/>
+        </w:rPr>
+        <w:t xml:space="preserve">Name: </w:t>
+      </w:r>
+      <w:r>
+        <w:t xml:space="preserve">Process Pattern pour l'initialisation d'un modèle de simulation chez </w:t>
+      </w:r>
+      <w:proofErr w:type="spellStart"/>
+      <w:r>
+        <w:t>Inoprod</w:t>
+      </w:r>
+      <w:proofErr w:type="spellEnd"/>
+    </w:p>
+    <w:p>
+      <w:pPr>
+        <w:jc w:val="both"/>
+      </w:pPr>
+      <w:r>
+        <w:rPr>
+          <w:b/>
+          <w:bCs/>
+        </w:rPr>
+        <w:t xml:space="preserve">Example Of Application </w:t>
+      </w:r>
+      <w:proofErr w:type="spellStart"/>
+      <w:r>
+        <w:rPr>
+          <w:b/>
+          <w:bCs/>
+        </w:rPr>
+        <w:t>Statements</w:t>
+      </w:r>
+      <w:proofErr w:type="spellEnd"/>
+      <w:r>
+        <w:rPr>
+          <w:b/>
+          <w:bCs/>
+        </w:rPr>
+        <w:t xml:space="preserve"> 1:</w:t>
+      </w:r>
+      <w:r>
+        <w:t xml:space="preserve"> Le </w:t>
+      </w:r>
+      <w:r>
+        <w:t>DTS d’intérêt</w:t>
+      </w:r>
+      <w:r>
+        <w:t xml:space="preserve"> est celui d'un atelier de production </w:t>
+      </w:r>
+      <w:r>
+        <w:t>de produit laitier</w:t>
+      </w:r>
+      <w:r>
+        <w:t xml:space="preserve">. Sa mission principale est d'assister le planificateur de l'atelier dans ses tâches liées à l'allocation des </w:t>
+      </w:r>
+      <w:r>
+        <w:t xml:space="preserve">différentes </w:t>
+      </w:r>
+      <w:r>
+        <w:t xml:space="preserve">ressources. Pour ce faire, le jumeau numérique (JN) du </w:t>
+      </w:r>
+      <w:r>
+        <w:t>DTS</w:t>
+      </w:r>
+      <w:r>
+        <w:t xml:space="preserve"> doit intégrer </w:t>
+      </w:r>
+      <w:r>
+        <w:t xml:space="preserve">modèle de simulation (sous </w:t>
+      </w:r>
+      <w:proofErr w:type="spellStart"/>
+      <w:r>
+        <w:t>PlantSimulation</w:t>
+      </w:r>
+      <w:proofErr w:type="spellEnd"/>
+      <w:r>
+        <w:t>) capable d’imiter les comportements réels de l’atelier</w:t>
+      </w:r>
+      <w:r>
+        <w:t>.</w:t>
+      </w:r>
+      <w:r>
+        <w:t xml:space="preserve"> En s’inspirant du modèle de processus générique du présent pattern, le lignes qui suivent décrivent les étapes ayant permis d’initialiser le modèle de simulation (son implémentation) sous </w:t>
+      </w:r>
+      <w:proofErr w:type="spellStart"/>
+      <w:r>
+        <w:t>PlantSimulation</w:t>
+      </w:r>
+      <w:proofErr w:type="spellEnd"/>
+      <w:r>
+        <w:t xml:space="preserve"> en question :</w:t>
+      </w:r>
+    </w:p>
+    <w:p>
+      <w:pPr>
+        <w:pStyle w:val="Paragraphedeliste"/>
+        <w:numPr>
+          <w:ilvl w:val="0"/>
+          <w:numId w:val="1"/>
+        </w:numPr>
+        <w:jc w:val="both"/>
+      </w:pPr>
+      <w:r>
+        <w:t>La zone principale de modélisation a été définie en appliquant directement une instance du « main  frame » standard d’</w:t>
+      </w:r>
+      <w:proofErr w:type="spellStart"/>
+      <w:r>
+        <w:t>Inoprod</w:t>
+      </w:r>
+      <w:proofErr w:type="spellEnd"/>
+      <w:r>
+        <w:t xml:space="preserve"> ; </w:t>
+      </w:r>
+    </w:p>
+    <w:p>
+      <w:pPr>
+        <w:pStyle w:val="Paragraphedeliste"/>
+        <w:numPr>
+          <w:ilvl w:val="0"/>
+          <w:numId w:val="1"/>
+        </w:numPr>
+        <w:jc w:val="both"/>
+      </w:pPr>
+      <w:r>
+        <w:lastRenderedPageBreak/>
+        <w:t xml:space="preserve">La zone </w:t>
+      </w:r>
+      <w:r>
+        <w:t>de données d’entrée</w:t>
+      </w:r>
+      <w:r>
+        <w:t xml:space="preserve"> de modélisation a été définie en </w:t>
+      </w:r>
+      <w:r>
+        <w:t xml:space="preserve">ajoutant la zone « Données d’entrée »  </w:t>
+      </w:r>
+      <w:r>
+        <w:t>standard d’</w:t>
+      </w:r>
+      <w:proofErr w:type="spellStart"/>
+      <w:r>
+        <w:t>Inoprod</w:t>
+      </w:r>
+      <w:proofErr w:type="spellEnd"/>
+      <w:r>
+        <w:t> </w:t>
+      </w:r>
+      <w:r>
+        <w:t xml:space="preserve">et à l’intérieur on a ajouté les instances de: 1 frame d’input </w:t>
+      </w:r>
+      <w:r>
+        <w:t xml:space="preserve">; </w:t>
+      </w:r>
+    </w:p>
+    <w:p>
+      <w:pPr>
+        <w:pStyle w:val="Paragraphedeliste"/>
+        <w:numPr>
+          <w:ilvl w:val="0"/>
+          <w:numId w:val="1"/>
+        </w:numPr>
+        <w:jc w:val="both"/>
+      </w:pPr>
+      <w:r>
+        <w:t>La zone de données d’</w:t>
+      </w:r>
+      <w:r>
+        <w:t>sortie</w:t>
+      </w:r>
+      <w:r>
+        <w:t xml:space="preserve"> de modélisation a été définie en ajoutant la zone « Données d</w:t>
+      </w:r>
+      <w:r>
+        <w:t>e sortie</w:t>
+      </w:r>
+      <w:r>
+        <w:t> </w:t>
+      </w:r>
+      <w:r>
+        <w:t>» standard</w:t>
+      </w:r>
+      <w:r>
+        <w:t xml:space="preserve"> d’</w:t>
+      </w:r>
+      <w:proofErr w:type="spellStart"/>
+      <w:r>
+        <w:t>Inoprod</w:t>
+      </w:r>
+      <w:proofErr w:type="spellEnd"/>
+      <w:r>
+        <w:t xml:space="preserve"> et à </w:t>
+      </w:r>
+      <w:r>
+        <w:t>l’intérieur on</w:t>
+      </w:r>
+      <w:r>
+        <w:t xml:space="preserve"> a ajouté les instances de: 1 frame d’</w:t>
+      </w:r>
+      <w:r>
+        <w:t xml:space="preserve">Output et 1 Frame de </w:t>
+      </w:r>
+      <w:proofErr w:type="spellStart"/>
+      <w:r>
+        <w:t>DBConnector</w:t>
+      </w:r>
+      <w:proofErr w:type="spellEnd"/>
+      <w:r>
+        <w:t xml:space="preserve"> ; </w:t>
+      </w:r>
+    </w:p>
+    <w:p>
+      <w:pPr>
+        <w:pStyle w:val="Paragraphedeliste"/>
+        <w:numPr>
+          <w:ilvl w:val="0"/>
+          <w:numId w:val="1"/>
+        </w:numPr>
+        <w:jc w:val="both"/>
+      </w:pPr>
+      <w:r>
+        <w:t>La zone d</w:t>
+      </w:r>
+      <w:r>
+        <w:t xml:space="preserve">édiée pour le pilotage et le contrôle du modèle </w:t>
+      </w:r>
+      <w:r>
+        <w:t>a été définie en ajoutant l</w:t>
+      </w:r>
+      <w:r>
+        <w:t>es</w:t>
+      </w:r>
+      <w:r>
+        <w:t xml:space="preserve"> zone « </w:t>
+      </w:r>
+      <w:r>
+        <w:t>Outils Inoprod</w:t>
+      </w:r>
+      <w:r>
+        <w:t> </w:t>
+      </w:r>
+      <w:r>
+        <w:t xml:space="preserve">» et « Contrôle de la simulation » </w:t>
+      </w:r>
+      <w:r>
+        <w:t>standard</w:t>
+      </w:r>
+      <w:r>
+        <w:t>s</w:t>
+      </w:r>
+      <w:r>
+        <w:t xml:space="preserve"> d’</w:t>
+      </w:r>
+      <w:proofErr w:type="spellStart"/>
+      <w:r>
+        <w:t>Inoprod</w:t>
+      </w:r>
+      <w:proofErr w:type="spellEnd"/>
+      <w:r>
+        <w:t xml:space="preserve">. Dans la première zone, on a ajouté les objets : 1 Meth, 1 </w:t>
+      </w:r>
+      <w:proofErr w:type="spellStart"/>
+      <w:r>
+        <w:t>Const</w:t>
+      </w:r>
+      <w:proofErr w:type="spellEnd"/>
+      <w:r>
+        <w:t xml:space="preserve">, 1 Vars, 1 </w:t>
+      </w:r>
+      <w:proofErr w:type="spellStart"/>
+      <w:r>
+        <w:t>Res</w:t>
+      </w:r>
+      <w:proofErr w:type="spellEnd"/>
+      <w:r>
+        <w:t xml:space="preserve">, 1 Event, 1 </w:t>
+      </w:r>
+      <w:proofErr w:type="spellStart"/>
+      <w:r>
+        <w:t>Objs</w:t>
+      </w:r>
+      <w:proofErr w:type="spellEnd"/>
+      <w:r>
+        <w:t xml:space="preserve">, 1 Stop et 1 Ctrl. Dans la seconde zone, les boutons standards de contrôle de la simulation suivants ont été ajoutés : </w:t>
+      </w:r>
+      <w:proofErr w:type="spellStart"/>
+      <w:r>
+        <w:t>OwnEventController</w:t>
+      </w:r>
+      <w:proofErr w:type="spellEnd"/>
+      <w:r>
+        <w:t xml:space="preserve">, </w:t>
+      </w:r>
+      <w:proofErr w:type="spellStart"/>
+      <w:r>
+        <w:t>ResetSimulation</w:t>
+      </w:r>
+      <w:proofErr w:type="spellEnd"/>
+      <w:r>
+        <w:t xml:space="preserve">, Start/Stop Simulation et Start Full Speed Simulation.   </w:t>
+      </w:r>
+      <w:r>
+        <w:t> </w:t>
+      </w:r>
+    </w:p>
+    <w:p>
+      <w:pPr>
+        <w:pStyle w:val="Paragraphedeliste"/>
+        <w:numPr>
+          <w:ilvl w:val="0"/>
+          <w:numId w:val="1"/>
+        </w:numPr>
+        <w:jc w:val="both"/>
+      </w:pPr>
+      <w:r>
+        <w:t>Une fois les précédentes étapes achevées, l’ajout des éléments relatifs à la logique métier du modèle de simulation a pu commencer.</w:t>
+      </w:r>
+    </w:p>
+    <w:p>
+      <w:pPr>
+        <w:jc w:val="both"/>
+      </w:pPr>
+      <w:r>
+        <w:rPr>
+          <w:b/>
+          <w:bCs/>
+        </w:rPr>
+        <w:t xml:space="preserve">Example Of Application </w:t>
+      </w:r>
+      <w:proofErr w:type="spellStart"/>
+      <w:r>
+        <w:rPr>
+          <w:b/>
+          <w:bCs/>
+        </w:rPr>
+        <w:t>Statements</w:t>
+      </w:r>
+      <w:proofErr w:type="spellEnd"/>
+      <w:r>
+        <w:rPr>
+          <w:b/>
+          <w:bCs/>
+        </w:rPr>
+        <w:t xml:space="preserve"> 2:</w:t>
+      </w:r>
+      <w:r>
+        <w:t xml:space="preserve"> Le </w:t>
+      </w:r>
+      <w:r>
+        <w:t>DTS d’intérêt</w:t>
+      </w:r>
+      <w:r>
+        <w:t xml:space="preserve"> est celui d'un</w:t>
+      </w:r>
+      <w:r>
+        <w:t xml:space="preserve">e (future) ligne </w:t>
+      </w:r>
+      <w:r>
+        <w:t xml:space="preserve">de production </w:t>
+      </w:r>
+      <w:r>
+        <w:t>de hublots de future génération d’aéronefs</w:t>
+      </w:r>
+      <w:r>
+        <w:t xml:space="preserve">. Sa mission principale est </w:t>
+      </w:r>
+      <w:r>
+        <w:t xml:space="preserve">de fournir à son utilisateur une représentation suffisamment représentative de cette ligne à </w:t>
+      </w:r>
+      <w:proofErr w:type="spellStart"/>
+      <w:r>
+        <w:t>concevori</w:t>
+      </w:r>
+      <w:proofErr w:type="spellEnd"/>
+      <w:r>
+        <w:t xml:space="preserve"> dans le future</w:t>
+      </w:r>
+      <w:r>
+        <w:t xml:space="preserve">. Pour ce faire, le jumeau numérique (JN) du </w:t>
+      </w:r>
+      <w:r>
+        <w:t>DTS</w:t>
+      </w:r>
+      <w:r>
+        <w:t xml:space="preserve"> doit intégrer </w:t>
+      </w:r>
+      <w:r>
+        <w:t xml:space="preserve">modèle de simulation (sous </w:t>
+      </w:r>
+      <w:proofErr w:type="spellStart"/>
+      <w:r>
+        <w:t>PlantSimulation</w:t>
+      </w:r>
+      <w:proofErr w:type="spellEnd"/>
+      <w:r>
+        <w:t xml:space="preserve">) capable d’imiter les comportements réels </w:t>
+      </w:r>
+      <w:r>
+        <w:t>de cette future ligne</w:t>
+      </w:r>
+      <w:r>
+        <w:t>.</w:t>
+      </w:r>
+      <w:r>
+        <w:t xml:space="preserve"> En s’inspirant du modèle de processus générique du présent pattern, le lignes qui suivent décrivent les étapes ayant permis d’initialiser le modèle de simulation (son implémentation) sous </w:t>
+      </w:r>
+      <w:proofErr w:type="spellStart"/>
+      <w:r>
+        <w:t>PlantSimulation</w:t>
+      </w:r>
+      <w:proofErr w:type="spellEnd"/>
+      <w:r>
+        <w:t xml:space="preserve"> en question :</w:t>
+      </w:r>
+    </w:p>
+    <w:p>
+      <w:pPr>
+        <w:pStyle w:val="Paragraphedeliste"/>
+        <w:numPr>
+          <w:ilvl w:val="0"/>
+          <w:numId w:val="1"/>
+        </w:numPr>
+        <w:jc w:val="both"/>
+      </w:pPr>
+      <w:r>
+        <w:t>La zone principale de modélisation a été définie en appliquant directement une instance du « main  frame » standard d’</w:t>
+      </w:r>
+      <w:proofErr w:type="spellStart"/>
+      <w:r>
+        <w:t>Inoprod</w:t>
+      </w:r>
+      <w:proofErr w:type="spellEnd"/>
+      <w:r>
+        <w:t xml:space="preserve"> ; </w:t>
+      </w:r>
+    </w:p>
+    <w:p>
+      <w:pPr>
+        <w:pStyle w:val="Paragraphedeliste"/>
+        <w:numPr>
+          <w:ilvl w:val="0"/>
+          <w:numId w:val="1"/>
+        </w:numPr>
+        <w:jc w:val="both"/>
+      </w:pPr>
+      <w:r>
+        <w:t>La zone de données d’entrée de modélisation a été définie en ajoutant la zone « Données d’entrée »  standard d’</w:t>
+      </w:r>
+      <w:proofErr w:type="spellStart"/>
+      <w:r>
+        <w:t>Inoprod</w:t>
+      </w:r>
+      <w:proofErr w:type="spellEnd"/>
+      <w:r>
+        <w:t xml:space="preserve"> et à l’intérieur on a ajouté les instances de: 1 frame d’input ; </w:t>
+      </w:r>
+    </w:p>
+    <w:p>
+      <w:pPr>
+        <w:pStyle w:val="Paragraphedeliste"/>
+        <w:numPr>
+          <w:ilvl w:val="0"/>
+          <w:numId w:val="1"/>
+        </w:numPr>
+        <w:jc w:val="both"/>
+      </w:pPr>
+      <w:r>
+        <w:t>La zone de données d’sortie de modélisation a été définie en ajoutant la zone « Données de sortie » standard d’</w:t>
+      </w:r>
+      <w:proofErr w:type="spellStart"/>
+      <w:r>
+        <w:t>Inoprod</w:t>
+      </w:r>
+      <w:proofErr w:type="spellEnd"/>
+      <w:r>
+        <w:t xml:space="preserve"> et à l’intérieur on a ajouté les instances de: 1 frame d’Output et 1 Frame de </w:t>
+      </w:r>
+      <w:proofErr w:type="spellStart"/>
+      <w:r>
+        <w:t>DBConnector</w:t>
+      </w:r>
+      <w:proofErr w:type="spellEnd"/>
+      <w:r>
+        <w:t xml:space="preserve"> ; </w:t>
+      </w:r>
+    </w:p>
+    <w:p>
+      <w:pPr>
+        <w:pStyle w:val="Paragraphedeliste"/>
+        <w:numPr>
+          <w:ilvl w:val="0"/>
+          <w:numId w:val="1"/>
+        </w:numPr>
+        <w:jc w:val="both"/>
+      </w:pPr>
+      <w:r>
+        <w:t>La zone dédiée pour le pilotage et le contrôle du modèle a été définie en ajoutant les zone « Outils Inoprod » et « Contrôle de la simulation » standards d’</w:t>
+      </w:r>
+      <w:proofErr w:type="spellStart"/>
+      <w:r>
+        <w:t>Inoprod</w:t>
+      </w:r>
+      <w:proofErr w:type="spellEnd"/>
+      <w:r>
+        <w:t xml:space="preserve">. Dans la première zone, on a ajouté les objets : 1 Meth, 1 </w:t>
+      </w:r>
+      <w:proofErr w:type="spellStart"/>
+      <w:r>
+        <w:t>Const</w:t>
+      </w:r>
+      <w:proofErr w:type="spellEnd"/>
+      <w:r>
+        <w:t xml:space="preserve">, 1 Vars, 1 </w:t>
+      </w:r>
+      <w:proofErr w:type="spellStart"/>
+      <w:r>
+        <w:t>Res</w:t>
+      </w:r>
+      <w:proofErr w:type="spellEnd"/>
+      <w:r>
+        <w:t xml:space="preserve">, 1 Event, 1 </w:t>
+      </w:r>
+      <w:proofErr w:type="spellStart"/>
+      <w:r>
+        <w:t>Objs</w:t>
+      </w:r>
+      <w:proofErr w:type="spellEnd"/>
+      <w:r>
+        <w:t xml:space="preserve">, 1 Stop et 1 Ctrl. Dans la seconde zone, les boutons standards de contrôle de la simulation suivants ont été ajoutés : </w:t>
+      </w:r>
+      <w:proofErr w:type="spellStart"/>
+      <w:r>
+        <w:t>OwnEventController</w:t>
+      </w:r>
+      <w:proofErr w:type="spellEnd"/>
+      <w:r>
+        <w:t xml:space="preserve">, </w:t>
+      </w:r>
+      <w:proofErr w:type="spellStart"/>
+      <w:r>
+        <w:t>ResetSimulation</w:t>
+      </w:r>
+      <w:proofErr w:type="spellEnd"/>
+      <w:r>
+        <w:t>, Start/Stop Simulation et Start Full Speed Simulation.    </w:t>
+      </w:r>
+    </w:p>
+    <w:p>
+      <w:pPr>
+        <w:pStyle w:val="Paragraphedeliste"/>
+        <w:numPr>
+          <w:ilvl w:val="0"/>
+          <w:numId w:val="1"/>
+        </w:numPr>
+        <w:jc w:val="both"/>
+      </w:pPr>
+      <w:r>
+        <w:t>Une fois les précédentes étapes achevées, l’ajout des éléments relatifs à la logique métier du modèle de simulation a pu commencer</w:t>
+      </w:r>
+      <w:r>
+        <w:t xml:space="preserve"> (par la modélisation des premiers équipements en tête de la ligne) </w:t>
+      </w:r>
+      <w:r>
+        <w:t>.</w:t>
+      </w:r>
+    </w:p>
+    <w:p>
+      <w:pPr>
+        <w:jc w:val="both"/>
+      </w:pPr>
+    </w:p>
+    <w:p/>
     <w:sectPr>
       <w:pgSz w:w="11906" w:h="16838"/>
       <w:pgMar w:top="1417" w:right="1417" w:bottom="1417" w:left="1417" w:header="708" w:footer="708" w:gutter="0"/>
@@ -2760,6 +4398,7 @@
   <w:style w:type="character" w:default="1" w:styleId="Policepardfaut">
     <w:name w:val="Default Paragraph Font"/>
     <w:uiPriority w:val="1"/>
+    <w:semiHidden/>
     <w:unhideWhenUsed/>
   </w:style>
   <w:style w:type="table" w:default="1" w:styleId="TableauNormal">

</xml_diff>